<commit_message>
Docker: complete chap 7
</commit_message>
<xml_diff>
--- a/Docker/1.docx
+++ b/Docker/1.docx
@@ -1702,7 +1702,23 @@
           <w:sz w:val="32"/>
           <w:szCs w:val="32"/>
         </w:rPr>
-        <w:t xml:space="preserve"> is a free tool to create cloud-style Linux VMs on Linux, Mac or Windows machine and easy to install and use. It’s easy way to create multi-node production like Docker clusters. It doesn’t ship with out-of-the box support: docker scout, </w:t>
+        <w:t xml:space="preserve"> is a free tool to create cloud-style Linux VMs on Linux, Mac or Windows machine and easy to install and use. It’s easy way to create multi-node production like Docker clusters. It doesn’t ship with out-of-the box support: </w:t>
+      </w:r>
+      <w:proofErr w:type="spellStart"/>
+      <w:r>
+        <w:rPr>
+          <w:sz w:val="32"/>
+          <w:szCs w:val="32"/>
+        </w:rPr>
+        <w:t>docker</w:t>
+      </w:r>
+      <w:proofErr w:type="spellEnd"/>
+      <w:r>
+        <w:rPr>
+          <w:sz w:val="32"/>
+          <w:szCs w:val="32"/>
+        </w:rPr>
+        <w:t xml:space="preserve"> scout, </w:t>
       </w:r>
       <w:proofErr w:type="spellStart"/>
       <w:r>
@@ -1991,7 +2007,23 @@
           <w:sz w:val="32"/>
           <w:szCs w:val="32"/>
         </w:rPr>
-        <w:t xml:space="preserve">-If you can’t use Docker Desktop, as it doesn’t give you access to docker scout, </w:t>
+        <w:t xml:space="preserve">-If you can’t use Docker Desktop, as it doesn’t give you access to </w:t>
+      </w:r>
+      <w:proofErr w:type="spellStart"/>
+      <w:r>
+        <w:rPr>
+          <w:sz w:val="32"/>
+          <w:szCs w:val="32"/>
+        </w:rPr>
+        <w:t>docker</w:t>
+      </w:r>
+      <w:proofErr w:type="spellEnd"/>
+      <w:r>
+        <w:rPr>
+          <w:sz w:val="32"/>
+          <w:szCs w:val="32"/>
+        </w:rPr>
+        <w:t xml:space="preserve"> scout, </w:t>
       </w:r>
       <w:proofErr w:type="spellStart"/>
       <w:r>
@@ -9990,8 +10022,6 @@
         <w:lastRenderedPageBreak/>
         <w:t>7.9 The docker inspect command</w:t>
       </w:r>
-      <w:bookmarkStart w:id="0" w:name="_GoBack"/>
-      <w:bookmarkEnd w:id="0"/>
     </w:p>
     <w:p>
       <w:pPr>
@@ -10055,6 +10085,63 @@
           <w:szCs w:val="32"/>
         </w:rPr>
       </w:pPr>
+      <w:r>
+        <w:rPr>
+          <w:sz w:val="32"/>
+          <w:szCs w:val="32"/>
+        </w:rPr>
+        <w:t>-</w:t>
+      </w:r>
+      <w:proofErr w:type="spellStart"/>
+      <w:r>
+        <w:rPr>
+          <w:b/>
+          <w:sz w:val="32"/>
+          <w:szCs w:val="32"/>
+        </w:rPr>
+        <w:t>docker</w:t>
+      </w:r>
+      <w:proofErr w:type="spellEnd"/>
+      <w:r>
+        <w:rPr>
+          <w:b/>
+          <w:sz w:val="32"/>
+          <w:szCs w:val="32"/>
+        </w:rPr>
+        <w:t xml:space="preserve"> exec -it &lt;container&gt; </w:t>
+      </w:r>
+      <w:proofErr w:type="spellStart"/>
+      <w:r>
+        <w:rPr>
+          <w:b/>
+          <w:sz w:val="32"/>
+          <w:szCs w:val="32"/>
+        </w:rPr>
+        <w:t>sh</w:t>
+      </w:r>
+      <w:proofErr w:type="spellEnd"/>
+      <w:r>
+        <w:rPr>
+          <w:sz w:val="32"/>
+          <w:szCs w:val="32"/>
+        </w:rPr>
+        <w:t>: open a new interactive exec session</w:t>
+      </w:r>
+    </w:p>
+    <w:p>
+      <w:pPr>
+        <w:rPr>
+          <w:sz w:val="32"/>
+          <w:szCs w:val="32"/>
+        </w:rPr>
+      </w:pPr>
+      <w:r>
+        <w:rPr>
+          <w:sz w:val="32"/>
+          <w:szCs w:val="32"/>
+        </w:rPr>
+        <w:t>-vi &lt;file&gt;: vi editor</w:t>
+      </w:r>
     </w:p>
     <w:p>
       <w:pPr>
@@ -10078,6 +10165,219 @@
           <w:szCs w:val="32"/>
         </w:rPr>
       </w:pPr>
+      <w:r>
+        <w:rPr>
+          <w:sz w:val="32"/>
+          <w:szCs w:val="32"/>
+        </w:rPr>
+        <w:t>-</w:t>
+      </w:r>
+      <w:proofErr w:type="spellStart"/>
+      <w:r>
+        <w:rPr>
+          <w:sz w:val="32"/>
+          <w:szCs w:val="32"/>
+        </w:rPr>
+        <w:t>docker</w:t>
+      </w:r>
+      <w:proofErr w:type="spellEnd"/>
+      <w:r>
+        <w:rPr>
+          <w:sz w:val="32"/>
+          <w:szCs w:val="32"/>
+        </w:rPr>
+        <w:t xml:space="preserve"> </w:t>
+      </w:r>
+      <w:proofErr w:type="spellStart"/>
+      <w:r>
+        <w:rPr>
+          <w:sz w:val="32"/>
+          <w:szCs w:val="32"/>
+        </w:rPr>
+        <w:t>ps</w:t>
+      </w:r>
+      <w:proofErr w:type="spellEnd"/>
+      <w:r>
+        <w:rPr>
+          <w:sz w:val="32"/>
+          <w:szCs w:val="32"/>
+        </w:rPr>
+        <w:t xml:space="preserve">: check running container </w:t>
+      </w:r>
+    </w:p>
+    <w:p>
+      <w:pPr>
+        <w:rPr>
+          <w:sz w:val="32"/>
+          <w:szCs w:val="32"/>
+        </w:rPr>
+      </w:pPr>
+      <w:r>
+        <w:rPr>
+          <w:sz w:val="32"/>
+          <w:szCs w:val="32"/>
+        </w:rPr>
+        <w:t>-</w:t>
+      </w:r>
+      <w:proofErr w:type="spellStart"/>
+      <w:r>
+        <w:rPr>
+          <w:b/>
+          <w:sz w:val="32"/>
+          <w:szCs w:val="32"/>
+        </w:rPr>
+        <w:t>docker</w:t>
+      </w:r>
+      <w:proofErr w:type="spellEnd"/>
+      <w:r>
+        <w:rPr>
+          <w:b/>
+          <w:sz w:val="32"/>
+          <w:szCs w:val="32"/>
+        </w:rPr>
+        <w:t xml:space="preserve"> stop &lt;container&gt;</w:t>
+      </w:r>
+      <w:r>
+        <w:rPr>
+          <w:sz w:val="32"/>
+          <w:szCs w:val="32"/>
+        </w:rPr>
+        <w:t>:  stop running container</w:t>
+      </w:r>
+    </w:p>
+    <w:p>
+      <w:pPr>
+        <w:rPr>
+          <w:sz w:val="32"/>
+          <w:szCs w:val="32"/>
+        </w:rPr>
+      </w:pPr>
+      <w:r>
+        <w:rPr>
+          <w:sz w:val="32"/>
+          <w:szCs w:val="32"/>
+        </w:rPr>
+        <w:t>-</w:t>
+      </w:r>
+      <w:proofErr w:type="spellStart"/>
+      <w:r>
+        <w:rPr>
+          <w:sz w:val="32"/>
+          <w:szCs w:val="32"/>
+        </w:rPr>
+        <w:t>docker</w:t>
+      </w:r>
+      <w:proofErr w:type="spellEnd"/>
+      <w:r>
+        <w:rPr>
+          <w:sz w:val="32"/>
+          <w:szCs w:val="32"/>
+        </w:rPr>
+        <w:t xml:space="preserve"> </w:t>
+      </w:r>
+      <w:proofErr w:type="spellStart"/>
+      <w:r>
+        <w:rPr>
+          <w:sz w:val="32"/>
+          <w:szCs w:val="32"/>
+        </w:rPr>
+        <w:t>ps</w:t>
+      </w:r>
+      <w:proofErr w:type="spellEnd"/>
+      <w:r>
+        <w:rPr>
+          <w:sz w:val="32"/>
+          <w:szCs w:val="32"/>
+        </w:rPr>
+        <w:t xml:space="preserve"> -a: show all containers</w:t>
+      </w:r>
+    </w:p>
+    <w:p>
+      <w:pPr>
+        <w:rPr>
+          <w:sz w:val="32"/>
+          <w:szCs w:val="32"/>
+        </w:rPr>
+      </w:pPr>
+      <w:r>
+        <w:rPr>
+          <w:sz w:val="32"/>
+          <w:szCs w:val="32"/>
+        </w:rPr>
+        <w:t>-</w:t>
+      </w:r>
+      <w:proofErr w:type="spellStart"/>
+      <w:r>
+        <w:rPr>
+          <w:b/>
+          <w:sz w:val="32"/>
+          <w:szCs w:val="32"/>
+        </w:rPr>
+        <w:t>docker</w:t>
+      </w:r>
+      <w:proofErr w:type="spellEnd"/>
+      <w:r>
+        <w:rPr>
+          <w:b/>
+          <w:sz w:val="32"/>
+          <w:szCs w:val="32"/>
+        </w:rPr>
+        <w:t xml:space="preserve"> restart &lt;container&gt;</w:t>
+      </w:r>
+      <w:r>
+        <w:rPr>
+          <w:sz w:val="32"/>
+          <w:szCs w:val="32"/>
+        </w:rPr>
+        <w:t>: restart container</w:t>
+      </w:r>
+    </w:p>
+    <w:p>
+      <w:pPr>
+        <w:rPr>
+          <w:sz w:val="32"/>
+          <w:szCs w:val="32"/>
+        </w:rPr>
+      </w:pPr>
+      <w:r>
+        <w:rPr>
+          <w:sz w:val="32"/>
+          <w:szCs w:val="32"/>
+        </w:rPr>
+        <w:t>-</w:t>
+      </w:r>
+      <w:proofErr w:type="spellStart"/>
+      <w:r>
+        <w:rPr>
+          <w:sz w:val="32"/>
+          <w:szCs w:val="32"/>
+        </w:rPr>
+        <w:t>docker</w:t>
+      </w:r>
+      <w:proofErr w:type="spellEnd"/>
+      <w:r>
+        <w:rPr>
+          <w:sz w:val="32"/>
+          <w:szCs w:val="32"/>
+        </w:rPr>
+        <w:t xml:space="preserve"> </w:t>
+      </w:r>
+      <w:proofErr w:type="spellStart"/>
+      <w:r>
+        <w:rPr>
+          <w:sz w:val="32"/>
+          <w:szCs w:val="32"/>
+        </w:rPr>
+        <w:t>rm</w:t>
+      </w:r>
+      <w:proofErr w:type="spellEnd"/>
+      <w:r>
+        <w:rPr>
+          <w:sz w:val="32"/>
+          <w:szCs w:val="32"/>
+        </w:rPr>
+        <w:t xml:space="preserve"> &lt;container&gt; -f: delete container</w:t>
+      </w:r>
     </w:p>
     <w:p>
       <w:pPr>
@@ -10101,6 +10401,44 @@
           <w:szCs w:val="32"/>
         </w:rPr>
       </w:pPr>
+      <w:r>
+        <w:rPr>
+          <w:sz w:val="32"/>
+          <w:szCs w:val="32"/>
+        </w:rPr>
+        <w:t>-Containers only run while their main process executes.</w:t>
+      </w:r>
+    </w:p>
+    <w:p>
+      <w:pPr>
+        <w:rPr>
+          <w:sz w:val="32"/>
+          <w:szCs w:val="32"/>
+        </w:rPr>
+      </w:pPr>
+      <w:r>
+        <w:rPr>
+          <w:sz w:val="32"/>
+          <w:szCs w:val="32"/>
+        </w:rPr>
+        <w:t>-</w:t>
+      </w:r>
+      <w:proofErr w:type="spellStart"/>
+      <w:r>
+        <w:rPr>
+          <w:sz w:val="32"/>
+          <w:szCs w:val="32"/>
+        </w:rPr>
+        <w:t>Crtl+PQ</w:t>
+      </w:r>
+      <w:proofErr w:type="spellEnd"/>
+      <w:r>
+        <w:rPr>
+          <w:sz w:val="32"/>
+          <w:szCs w:val="32"/>
+        </w:rPr>
+        <w:t>: exit a container without killing process you’re attached to</w:t>
+      </w:r>
     </w:p>
     <w:p>
       <w:pPr>
@@ -10124,6 +10462,13 @@
           <w:szCs w:val="32"/>
         </w:rPr>
       </w:pPr>
+      <w:r>
+        <w:rPr>
+          <w:sz w:val="32"/>
+          <w:szCs w:val="32"/>
+        </w:rPr>
+        <w:t>-Require Pro/Team/Business subscription.</w:t>
+      </w:r>
     </w:p>
     <w:p>
       <w:pPr>
@@ -10147,6 +10492,354 @@
           <w:szCs w:val="32"/>
         </w:rPr>
       </w:pPr>
+      <w:r>
+        <w:rPr>
+          <w:sz w:val="32"/>
+          <w:szCs w:val="32"/>
+        </w:rPr>
+        <w:t>-Container restart policies are a simple form of self-healing that allows local Docker Engine to automatically restart failed containers.</w:t>
+      </w:r>
+    </w:p>
+    <w:p>
+      <w:pPr>
+        <w:rPr>
+          <w:sz w:val="32"/>
+          <w:szCs w:val="32"/>
+        </w:rPr>
+      </w:pPr>
+      <w:r>
+        <w:rPr>
+          <w:sz w:val="32"/>
+          <w:szCs w:val="32"/>
+        </w:rPr>
+        <w:t>-You apply restart policies per container, Docker supports 4 policies: no (default), on-failure, always, unless-stopped.</w:t>
+      </w:r>
+    </w:p>
+    <w:p>
+      <w:pPr>
+        <w:rPr>
+          <w:sz w:val="32"/>
+          <w:szCs w:val="32"/>
+        </w:rPr>
+      </w:pPr>
+      <w:r>
+        <w:rPr>
+          <w:noProof/>
+        </w:rPr>
+        <w:lastRenderedPageBreak/>
+        <w:drawing>
+          <wp:inline distT="0" distB="0" distL="0" distR="0" wp14:anchorId="55DFDA90" wp14:editId="6CDA7A56">
+            <wp:extent cx="4133850" cy="1286252"/>
+            <wp:effectExtent l="0" t="0" r="0" b="9525"/>
+            <wp:docPr id="4" name="Picture 4"/>
+            <wp:cNvGraphicFramePr>
+              <a:graphicFrameLocks xmlns:a="http://schemas.openxmlformats.org/drawingml/2006/main" noChangeAspect="1"/>
+            </wp:cNvGraphicFramePr>
+            <a:graphic xmlns:a="http://schemas.openxmlformats.org/drawingml/2006/main">
+              <a:graphicData uri="http://schemas.openxmlformats.org/drawingml/2006/picture">
+                <pic:pic xmlns:pic="http://schemas.openxmlformats.org/drawingml/2006/picture">
+                  <pic:nvPicPr>
+                    <pic:cNvPr id="1" name=""/>
+                    <pic:cNvPicPr/>
+                  </pic:nvPicPr>
+                  <pic:blipFill>
+                    <a:blip r:embed="rId27"/>
+                    <a:stretch>
+                      <a:fillRect/>
+                    </a:stretch>
+                  </pic:blipFill>
+                  <pic:spPr>
+                    <a:xfrm>
+                      <a:off x="0" y="0"/>
+                      <a:ext cx="4163815" cy="1295576"/>
+                    </a:xfrm>
+                    <a:prstGeom prst="rect">
+                      <a:avLst/>
+                    </a:prstGeom>
+                  </pic:spPr>
+                </pic:pic>
+              </a:graphicData>
+            </a:graphic>
+          </wp:inline>
+        </w:drawing>
+      </w:r>
+    </w:p>
+    <w:p>
+      <w:pPr>
+        <w:rPr>
+          <w:sz w:val="32"/>
+          <w:szCs w:val="32"/>
+        </w:rPr>
+      </w:pPr>
+      <w:r>
+        <w:rPr>
+          <w:sz w:val="32"/>
+          <w:szCs w:val="32"/>
+        </w:rPr>
+        <w:t>-</w:t>
+      </w:r>
+      <w:proofErr w:type="spellStart"/>
+      <w:r>
+        <w:rPr>
+          <w:sz w:val="32"/>
+          <w:szCs w:val="32"/>
+        </w:rPr>
+        <w:t>docker</w:t>
+      </w:r>
+      <w:proofErr w:type="spellEnd"/>
+      <w:r>
+        <w:rPr>
+          <w:sz w:val="32"/>
+          <w:szCs w:val="32"/>
+        </w:rPr>
+        <w:t xml:space="preserve"> run --name &lt;container&gt; -it --restart &lt;</w:t>
+      </w:r>
+      <w:proofErr w:type="spellStart"/>
+      <w:r>
+        <w:rPr>
+          <w:sz w:val="32"/>
+          <w:szCs w:val="32"/>
+        </w:rPr>
+        <w:t>restart_policy</w:t>
+      </w:r>
+      <w:proofErr w:type="spellEnd"/>
+      <w:r>
+        <w:rPr>
+          <w:sz w:val="32"/>
+          <w:szCs w:val="32"/>
+        </w:rPr>
+        <w:t xml:space="preserve">&gt; &lt;image&gt; </w:t>
+      </w:r>
+      <w:proofErr w:type="spellStart"/>
+      <w:r>
+        <w:rPr>
+          <w:sz w:val="32"/>
+          <w:szCs w:val="32"/>
+        </w:rPr>
+        <w:t>sh</w:t>
+      </w:r>
+      <w:proofErr w:type="spellEnd"/>
+    </w:p>
+    <w:p>
+      <w:pPr>
+        <w:rPr>
+          <w:sz w:val="32"/>
+          <w:szCs w:val="32"/>
+        </w:rPr>
+      </w:pPr>
+      <w:r>
+        <w:rPr>
+          <w:sz w:val="32"/>
+          <w:szCs w:val="32"/>
+        </w:rPr>
+        <w:t>-</w:t>
+      </w:r>
+      <w:proofErr w:type="spellStart"/>
+      <w:r>
+        <w:rPr>
+          <w:sz w:val="32"/>
+          <w:szCs w:val="32"/>
+        </w:rPr>
+        <w:t>docker</w:t>
+      </w:r>
+      <w:proofErr w:type="spellEnd"/>
+      <w:r>
+        <w:rPr>
+          <w:sz w:val="32"/>
+          <w:szCs w:val="32"/>
+        </w:rPr>
+        <w:t xml:space="preserve"> inspect &lt;container&gt; | </w:t>
+      </w:r>
+      <w:proofErr w:type="spellStart"/>
+      <w:r>
+        <w:rPr>
+          <w:sz w:val="32"/>
+          <w:szCs w:val="32"/>
+        </w:rPr>
+        <w:t>grep</w:t>
+      </w:r>
+      <w:proofErr w:type="spellEnd"/>
+      <w:r>
+        <w:rPr>
+          <w:sz w:val="32"/>
+          <w:szCs w:val="32"/>
+        </w:rPr>
+        <w:t xml:space="preserve"> </w:t>
+      </w:r>
+      <w:proofErr w:type="spellStart"/>
+      <w:r>
+        <w:rPr>
+          <w:sz w:val="32"/>
+          <w:szCs w:val="32"/>
+        </w:rPr>
+        <w:t>RestartCount</w:t>
+      </w:r>
+      <w:proofErr w:type="spellEnd"/>
+      <w:r>
+        <w:rPr>
+          <w:sz w:val="32"/>
+          <w:szCs w:val="32"/>
+        </w:rPr>
+        <w:t xml:space="preserve">: </w:t>
+      </w:r>
+    </w:p>
+    <w:p>
+      <w:pPr>
+        <w:rPr>
+          <w:sz w:val="32"/>
+          <w:szCs w:val="32"/>
+        </w:rPr>
+      </w:pPr>
+      <w:r>
+        <w:rPr>
+          <w:sz w:val="32"/>
+          <w:szCs w:val="32"/>
+        </w:rPr>
+        <w:t>-Work with Docker Compose:</w:t>
+      </w:r>
+    </w:p>
+    <w:p>
+      <w:pPr>
+        <w:rPr>
+          <w:sz w:val="32"/>
+          <w:szCs w:val="32"/>
+        </w:rPr>
+      </w:pPr>
+      <w:r>
+        <w:rPr>
+          <w:noProof/>
+        </w:rPr>
+        <w:drawing>
+          <wp:inline distT="0" distB="0" distL="0" distR="0" wp14:anchorId="4F376FC3" wp14:editId="17829362">
+            <wp:extent cx="3724275" cy="709386"/>
+            <wp:effectExtent l="0" t="0" r="0" b="0"/>
+            <wp:docPr id="5" name="Picture 5"/>
+            <wp:cNvGraphicFramePr>
+              <a:graphicFrameLocks xmlns:a="http://schemas.openxmlformats.org/drawingml/2006/main" noChangeAspect="1"/>
+            </wp:cNvGraphicFramePr>
+            <a:graphic xmlns:a="http://schemas.openxmlformats.org/drawingml/2006/main">
+              <a:graphicData uri="http://schemas.openxmlformats.org/drawingml/2006/picture">
+                <pic:pic xmlns:pic="http://schemas.openxmlformats.org/drawingml/2006/picture">
+                  <pic:nvPicPr>
+                    <pic:cNvPr id="1" name=""/>
+                    <pic:cNvPicPr/>
+                  </pic:nvPicPr>
+                  <pic:blipFill>
+                    <a:blip r:embed="rId28"/>
+                    <a:stretch>
+                      <a:fillRect/>
+                    </a:stretch>
+                  </pic:blipFill>
+                  <pic:spPr>
+                    <a:xfrm>
+                      <a:off x="0" y="0"/>
+                      <a:ext cx="3732912" cy="711031"/>
+                    </a:xfrm>
+                    <a:prstGeom prst="rect">
+                      <a:avLst/>
+                    </a:prstGeom>
+                  </pic:spPr>
+                </pic:pic>
+              </a:graphicData>
+            </a:graphic>
+          </wp:inline>
+        </w:drawing>
+      </w:r>
+    </w:p>
+    <w:p>
+      <w:pPr>
+        <w:rPr>
+          <w:sz w:val="32"/>
+          <w:szCs w:val="32"/>
+        </w:rPr>
+      </w:pPr>
+      <w:r>
+        <w:rPr>
+          <w:sz w:val="32"/>
+          <w:szCs w:val="32"/>
+        </w:rPr>
+        <w:t>-Clean up</w:t>
+      </w:r>
+    </w:p>
+    <w:p>
+      <w:pPr>
+        <w:rPr>
+          <w:sz w:val="32"/>
+          <w:szCs w:val="32"/>
+        </w:rPr>
+      </w:pPr>
+      <w:proofErr w:type="spellStart"/>
+      <w:r>
+        <w:rPr>
+          <w:sz w:val="32"/>
+          <w:szCs w:val="32"/>
+        </w:rPr>
+        <w:t>docker</w:t>
+      </w:r>
+      <w:proofErr w:type="spellEnd"/>
+      <w:r>
+        <w:rPr>
+          <w:sz w:val="32"/>
+          <w:szCs w:val="32"/>
+        </w:rPr>
+        <w:t xml:space="preserve"> </w:t>
+      </w:r>
+      <w:proofErr w:type="spellStart"/>
+      <w:r>
+        <w:rPr>
+          <w:sz w:val="32"/>
+          <w:szCs w:val="32"/>
+        </w:rPr>
+        <w:t>rm</w:t>
+      </w:r>
+      <w:proofErr w:type="spellEnd"/>
+      <w:r>
+        <w:rPr>
+          <w:sz w:val="32"/>
+          <w:szCs w:val="32"/>
+        </w:rPr>
+        <w:t xml:space="preserve"> &lt;container&gt; -f </w:t>
+      </w:r>
+    </w:p>
+    <w:p>
+      <w:pPr>
+        <w:rPr>
+          <w:sz w:val="32"/>
+          <w:szCs w:val="32"/>
+        </w:rPr>
+      </w:pPr>
+      <w:proofErr w:type="spellStart"/>
+      <w:r>
+        <w:rPr>
+          <w:sz w:val="32"/>
+          <w:szCs w:val="32"/>
+        </w:rPr>
+        <w:t>docker</w:t>
+      </w:r>
+      <w:proofErr w:type="spellEnd"/>
+      <w:r>
+        <w:rPr>
+          <w:sz w:val="32"/>
+          <w:szCs w:val="32"/>
+        </w:rPr>
+        <w:t xml:space="preserve"> </w:t>
+      </w:r>
+      <w:proofErr w:type="spellStart"/>
+      <w:r>
+        <w:rPr>
+          <w:sz w:val="32"/>
+          <w:szCs w:val="32"/>
+        </w:rPr>
+        <w:t>rmi</w:t>
+      </w:r>
+      <w:proofErr w:type="spellEnd"/>
+      <w:r>
+        <w:rPr>
+          <w:sz w:val="32"/>
+          <w:szCs w:val="32"/>
+        </w:rPr>
+        <w:t xml:space="preserve"> &lt;image&gt;</w:t>
+      </w:r>
     </w:p>
     <w:p>
       <w:pPr>
@@ -10163,6 +10856,727 @@
         <w:t>7.15 Containers-The commands</w:t>
       </w:r>
     </w:p>
+    <w:tbl>
+      <w:tblPr>
+        <w:tblStyle w:val="TableGrid"/>
+        <w:tblW w:w="0" w:type="auto"/>
+        <w:tblLook w:val="04A0" w:firstRow="1" w:lastRow="0" w:firstColumn="1" w:lastColumn="0" w:noHBand="0" w:noVBand="1"/>
+      </w:tblPr>
+      <w:tblGrid>
+        <w:gridCol w:w="5485"/>
+        <w:gridCol w:w="3865"/>
+      </w:tblGrid>
+      <w:tr>
+        <w:tc>
+          <w:tcPr>
+            <w:tcW w:w="5485" w:type="dxa"/>
+          </w:tcPr>
+          <w:p>
+            <w:pPr>
+              <w:rPr>
+                <w:sz w:val="32"/>
+                <w:szCs w:val="32"/>
+              </w:rPr>
+            </w:pPr>
+            <w:proofErr w:type="spellStart"/>
+            <w:r>
+              <w:rPr>
+                <w:sz w:val="32"/>
+                <w:szCs w:val="32"/>
+              </w:rPr>
+              <w:t>docker</w:t>
+            </w:r>
+            <w:proofErr w:type="spellEnd"/>
+            <w:r>
+              <w:rPr>
+                <w:sz w:val="32"/>
+                <w:szCs w:val="32"/>
+              </w:rPr>
+              <w:t xml:space="preserve"> run –d --name &lt;container&gt; -p &lt;</w:t>
+            </w:r>
+            <w:proofErr w:type="spellStart"/>
+            <w:r>
+              <w:rPr>
+                <w:sz w:val="32"/>
+                <w:szCs w:val="32"/>
+              </w:rPr>
+              <w:t>port_out</w:t>
+            </w:r>
+            <w:proofErr w:type="spellEnd"/>
+            <w:r>
+              <w:rPr>
+                <w:sz w:val="32"/>
+                <w:szCs w:val="32"/>
+              </w:rPr>
+              <w:t>&gt;:&lt;</w:t>
+            </w:r>
+            <w:proofErr w:type="spellStart"/>
+            <w:r>
+              <w:rPr>
+                <w:sz w:val="32"/>
+                <w:szCs w:val="32"/>
+              </w:rPr>
+              <w:t>port_in</w:t>
+            </w:r>
+            <w:proofErr w:type="spellEnd"/>
+            <w:r>
+              <w:rPr>
+                <w:sz w:val="32"/>
+                <w:szCs w:val="32"/>
+              </w:rPr>
+              <w:t>&gt; &lt;image&gt;:&lt;tag&gt;</w:t>
+            </w:r>
+          </w:p>
+        </w:tc>
+        <w:tc>
+          <w:tcPr>
+            <w:tcW w:w="3865" w:type="dxa"/>
+          </w:tcPr>
+          <w:p>
+            <w:pPr>
+              <w:rPr>
+                <w:sz w:val="32"/>
+                <w:szCs w:val="32"/>
+              </w:rPr>
+            </w:pPr>
+            <w:r>
+              <w:rPr>
+                <w:sz w:val="32"/>
+                <w:szCs w:val="32"/>
+              </w:rPr>
+              <w:t>Start new container</w:t>
+            </w:r>
+          </w:p>
+        </w:tc>
+      </w:tr>
+      <w:tr>
+        <w:tc>
+          <w:tcPr>
+            <w:tcW w:w="5485" w:type="dxa"/>
+          </w:tcPr>
+          <w:p>
+            <w:pPr>
+              <w:rPr>
+                <w:sz w:val="32"/>
+                <w:szCs w:val="32"/>
+              </w:rPr>
+            </w:pPr>
+            <w:r>
+              <w:rPr>
+                <w:sz w:val="32"/>
+                <w:szCs w:val="32"/>
+              </w:rPr>
+              <w:t>Ctrl PQ</w:t>
+            </w:r>
+          </w:p>
+        </w:tc>
+        <w:tc>
+          <w:tcPr>
+            <w:tcW w:w="3865" w:type="dxa"/>
+          </w:tcPr>
+          <w:p>
+            <w:pPr>
+              <w:rPr>
+                <w:sz w:val="32"/>
+                <w:szCs w:val="32"/>
+              </w:rPr>
+            </w:pPr>
+            <w:r>
+              <w:rPr>
+                <w:sz w:val="32"/>
+                <w:szCs w:val="32"/>
+              </w:rPr>
+              <w:t>Detach from a container without killing process</w:t>
+            </w:r>
+          </w:p>
+        </w:tc>
+      </w:tr>
+      <w:tr>
+        <w:tc>
+          <w:tcPr>
+            <w:tcW w:w="5485" w:type="dxa"/>
+          </w:tcPr>
+          <w:p>
+            <w:pPr>
+              <w:rPr>
+                <w:sz w:val="32"/>
+                <w:szCs w:val="32"/>
+              </w:rPr>
+            </w:pPr>
+            <w:proofErr w:type="spellStart"/>
+            <w:r>
+              <w:rPr>
+                <w:sz w:val="32"/>
+                <w:szCs w:val="32"/>
+              </w:rPr>
+              <w:t>docker</w:t>
+            </w:r>
+            <w:proofErr w:type="spellEnd"/>
+            <w:r>
+              <w:rPr>
+                <w:sz w:val="32"/>
+                <w:szCs w:val="32"/>
+              </w:rPr>
+              <w:t xml:space="preserve"> </w:t>
+            </w:r>
+            <w:proofErr w:type="spellStart"/>
+            <w:r>
+              <w:rPr>
+                <w:sz w:val="32"/>
+                <w:szCs w:val="32"/>
+              </w:rPr>
+              <w:t>ps</w:t>
+            </w:r>
+            <w:proofErr w:type="spellEnd"/>
+          </w:p>
+        </w:tc>
+        <w:tc>
+          <w:tcPr>
+            <w:tcW w:w="3865" w:type="dxa"/>
+          </w:tcPr>
+          <w:p>
+            <w:pPr>
+              <w:rPr>
+                <w:sz w:val="32"/>
+                <w:szCs w:val="32"/>
+              </w:rPr>
+            </w:pPr>
+            <w:r>
+              <w:rPr>
+                <w:sz w:val="32"/>
+                <w:szCs w:val="32"/>
+              </w:rPr>
+              <w:t xml:space="preserve">List running containers </w:t>
+            </w:r>
+          </w:p>
+        </w:tc>
+      </w:tr>
+      <w:tr>
+        <w:tc>
+          <w:tcPr>
+            <w:tcW w:w="5485" w:type="dxa"/>
+          </w:tcPr>
+          <w:p>
+            <w:pPr>
+              <w:rPr>
+                <w:sz w:val="32"/>
+                <w:szCs w:val="32"/>
+              </w:rPr>
+            </w:pPr>
+            <w:proofErr w:type="spellStart"/>
+            <w:r>
+              <w:rPr>
+                <w:sz w:val="32"/>
+                <w:szCs w:val="32"/>
+              </w:rPr>
+              <w:t>docker</w:t>
+            </w:r>
+            <w:proofErr w:type="spellEnd"/>
+            <w:r>
+              <w:rPr>
+                <w:sz w:val="32"/>
+                <w:szCs w:val="32"/>
+              </w:rPr>
+              <w:t xml:space="preserve"> </w:t>
+            </w:r>
+            <w:proofErr w:type="spellStart"/>
+            <w:r>
+              <w:rPr>
+                <w:sz w:val="32"/>
+                <w:szCs w:val="32"/>
+              </w:rPr>
+              <w:t>ps</w:t>
+            </w:r>
+            <w:proofErr w:type="spellEnd"/>
+            <w:r>
+              <w:rPr>
+                <w:sz w:val="32"/>
+                <w:szCs w:val="32"/>
+              </w:rPr>
+              <w:t xml:space="preserve"> –a</w:t>
+            </w:r>
+          </w:p>
+        </w:tc>
+        <w:tc>
+          <w:tcPr>
+            <w:tcW w:w="3865" w:type="dxa"/>
+          </w:tcPr>
+          <w:p>
+            <w:pPr>
+              <w:rPr>
+                <w:sz w:val="32"/>
+                <w:szCs w:val="32"/>
+              </w:rPr>
+            </w:pPr>
+            <w:r>
+              <w:rPr>
+                <w:sz w:val="32"/>
+                <w:szCs w:val="32"/>
+              </w:rPr>
+              <w:t>List all containers</w:t>
+            </w:r>
+          </w:p>
+        </w:tc>
+      </w:tr>
+      <w:tr>
+        <w:tc>
+          <w:tcPr>
+            <w:tcW w:w="5485" w:type="dxa"/>
+          </w:tcPr>
+          <w:p>
+            <w:pPr>
+              <w:rPr>
+                <w:sz w:val="32"/>
+                <w:szCs w:val="32"/>
+              </w:rPr>
+            </w:pPr>
+            <w:proofErr w:type="spellStart"/>
+            <w:r>
+              <w:rPr>
+                <w:bCs/>
+                <w:sz w:val="32"/>
+                <w:szCs w:val="32"/>
+              </w:rPr>
+              <w:t>docker</w:t>
+            </w:r>
+            <w:proofErr w:type="spellEnd"/>
+            <w:r>
+              <w:rPr>
+                <w:bCs/>
+                <w:sz w:val="32"/>
+                <w:szCs w:val="32"/>
+              </w:rPr>
+              <w:t xml:space="preserve"> exec -it  &lt;</w:t>
+            </w:r>
+            <w:proofErr w:type="spellStart"/>
+            <w:r>
+              <w:rPr>
+                <w:bCs/>
+                <w:sz w:val="32"/>
+                <w:szCs w:val="32"/>
+              </w:rPr>
+              <w:t>container_name</w:t>
+            </w:r>
+            <w:proofErr w:type="spellEnd"/>
+            <w:r>
+              <w:rPr>
+                <w:bCs/>
+                <w:sz w:val="32"/>
+                <w:szCs w:val="32"/>
+              </w:rPr>
+              <w:t>&gt; bash</w:t>
+            </w:r>
+          </w:p>
+        </w:tc>
+        <w:tc>
+          <w:tcPr>
+            <w:tcW w:w="3865" w:type="dxa"/>
+          </w:tcPr>
+          <w:p>
+            <w:pPr>
+              <w:rPr>
+                <w:sz w:val="32"/>
+                <w:szCs w:val="32"/>
+              </w:rPr>
+            </w:pPr>
+            <w:r>
+              <w:rPr>
+                <w:sz w:val="32"/>
+                <w:szCs w:val="32"/>
+              </w:rPr>
+              <w:t xml:space="preserve">Start a new Bash shell inside running container </w:t>
+            </w:r>
+            <w:r>
+              <w:rPr>
+                <w:sz w:val="32"/>
+                <w:szCs w:val="32"/>
+              </w:rPr>
+              <w:t>and connect your terminal to it</w:t>
+            </w:r>
+          </w:p>
+        </w:tc>
+      </w:tr>
+      <w:tr>
+        <w:tc>
+          <w:tcPr>
+            <w:tcW w:w="5485" w:type="dxa"/>
+          </w:tcPr>
+          <w:p>
+            <w:pPr>
+              <w:rPr>
+                <w:bCs/>
+                <w:sz w:val="32"/>
+                <w:szCs w:val="32"/>
+              </w:rPr>
+            </w:pPr>
+            <w:proofErr w:type="spellStart"/>
+            <w:r>
+              <w:rPr>
+                <w:bCs/>
+                <w:sz w:val="32"/>
+                <w:szCs w:val="32"/>
+              </w:rPr>
+              <w:t>docker</w:t>
+            </w:r>
+            <w:proofErr w:type="spellEnd"/>
+            <w:r>
+              <w:rPr>
+                <w:bCs/>
+                <w:sz w:val="32"/>
+                <w:szCs w:val="32"/>
+              </w:rPr>
+              <w:t xml:space="preserve"> exec -it &lt;container&gt; </w:t>
+            </w:r>
+            <w:proofErr w:type="spellStart"/>
+            <w:r>
+              <w:rPr>
+                <w:bCs/>
+                <w:sz w:val="32"/>
+                <w:szCs w:val="32"/>
+              </w:rPr>
+              <w:t>ps</w:t>
+            </w:r>
+            <w:proofErr w:type="spellEnd"/>
+          </w:p>
+        </w:tc>
+        <w:tc>
+          <w:tcPr>
+            <w:tcW w:w="3865" w:type="dxa"/>
+          </w:tcPr>
+          <w:p>
+            <w:pPr>
+              <w:rPr>
+                <w:sz w:val="32"/>
+                <w:szCs w:val="32"/>
+              </w:rPr>
+            </w:pPr>
+            <w:r>
+              <w:rPr>
+                <w:sz w:val="32"/>
+                <w:szCs w:val="32"/>
+              </w:rPr>
+              <w:t xml:space="preserve">Run a </w:t>
+            </w:r>
+            <w:proofErr w:type="spellStart"/>
+            <w:r>
+              <w:rPr>
+                <w:sz w:val="32"/>
+                <w:szCs w:val="32"/>
+              </w:rPr>
+              <w:t>ps</w:t>
+            </w:r>
+            <w:proofErr w:type="spellEnd"/>
+            <w:r>
+              <w:rPr>
+                <w:sz w:val="32"/>
+                <w:szCs w:val="32"/>
+              </w:rPr>
+              <w:t xml:space="preserve"> command inside running container without </w:t>
+            </w:r>
+            <w:r>
+              <w:rPr>
+                <w:sz w:val="32"/>
+                <w:szCs w:val="32"/>
+              </w:rPr>
+              <w:lastRenderedPageBreak/>
+              <w:t>opening an interactive shell session</w:t>
+            </w:r>
+          </w:p>
+        </w:tc>
+      </w:tr>
+      <w:tr>
+        <w:tc>
+          <w:tcPr>
+            <w:tcW w:w="5485" w:type="dxa"/>
+          </w:tcPr>
+          <w:p>
+            <w:pPr>
+              <w:rPr>
+                <w:b/>
+                <w:bCs/>
+                <w:sz w:val="32"/>
+                <w:szCs w:val="32"/>
+              </w:rPr>
+            </w:pPr>
+            <w:proofErr w:type="spellStart"/>
+            <w:r>
+              <w:rPr>
+                <w:sz w:val="32"/>
+                <w:szCs w:val="32"/>
+              </w:rPr>
+              <w:lastRenderedPageBreak/>
+              <w:t>docker</w:t>
+            </w:r>
+            <w:proofErr w:type="spellEnd"/>
+            <w:r>
+              <w:rPr>
+                <w:sz w:val="32"/>
+                <w:szCs w:val="32"/>
+              </w:rPr>
+              <w:t xml:space="preserve"> stop &lt;container&gt;</w:t>
+            </w:r>
+          </w:p>
+        </w:tc>
+        <w:tc>
+          <w:tcPr>
+            <w:tcW w:w="3865" w:type="dxa"/>
+          </w:tcPr>
+          <w:p>
+            <w:pPr>
+              <w:rPr>
+                <w:sz w:val="32"/>
+                <w:szCs w:val="32"/>
+              </w:rPr>
+            </w:pPr>
+            <w:r>
+              <w:rPr>
+                <w:sz w:val="32"/>
+                <w:szCs w:val="32"/>
+              </w:rPr>
+              <w:t>Stop running container</w:t>
+            </w:r>
+          </w:p>
+        </w:tc>
+      </w:tr>
+      <w:tr>
+        <w:tc>
+          <w:tcPr>
+            <w:tcW w:w="5485" w:type="dxa"/>
+          </w:tcPr>
+          <w:p>
+            <w:pPr>
+              <w:rPr>
+                <w:sz w:val="32"/>
+                <w:szCs w:val="32"/>
+              </w:rPr>
+            </w:pPr>
+            <w:proofErr w:type="spellStart"/>
+            <w:r>
+              <w:rPr>
+                <w:sz w:val="32"/>
+                <w:szCs w:val="32"/>
+              </w:rPr>
+              <w:t>docker</w:t>
+            </w:r>
+            <w:proofErr w:type="spellEnd"/>
+            <w:r>
+              <w:rPr>
+                <w:sz w:val="32"/>
+                <w:szCs w:val="32"/>
+              </w:rPr>
+              <w:t xml:space="preserve"> restart &lt;container&gt;</w:t>
+            </w:r>
+          </w:p>
+        </w:tc>
+        <w:tc>
+          <w:tcPr>
+            <w:tcW w:w="3865" w:type="dxa"/>
+          </w:tcPr>
+          <w:p>
+            <w:pPr>
+              <w:rPr>
+                <w:sz w:val="32"/>
+                <w:szCs w:val="32"/>
+              </w:rPr>
+            </w:pPr>
+            <w:r>
+              <w:rPr>
+                <w:sz w:val="32"/>
+                <w:szCs w:val="32"/>
+              </w:rPr>
+              <w:t>Restart stopped container</w:t>
+            </w:r>
+          </w:p>
+        </w:tc>
+      </w:tr>
+      <w:tr>
+        <w:tc>
+          <w:tcPr>
+            <w:tcW w:w="5485" w:type="dxa"/>
+          </w:tcPr>
+          <w:p>
+            <w:pPr>
+              <w:rPr>
+                <w:sz w:val="32"/>
+                <w:szCs w:val="32"/>
+              </w:rPr>
+            </w:pPr>
+            <w:proofErr w:type="spellStart"/>
+            <w:r>
+              <w:rPr>
+                <w:sz w:val="32"/>
+                <w:szCs w:val="32"/>
+              </w:rPr>
+              <w:t>docker</w:t>
+            </w:r>
+            <w:proofErr w:type="spellEnd"/>
+            <w:r>
+              <w:rPr>
+                <w:sz w:val="32"/>
+                <w:szCs w:val="32"/>
+              </w:rPr>
+              <w:t xml:space="preserve"> </w:t>
+            </w:r>
+            <w:proofErr w:type="spellStart"/>
+            <w:r>
+              <w:rPr>
+                <w:sz w:val="32"/>
+                <w:szCs w:val="32"/>
+              </w:rPr>
+              <w:t>rm</w:t>
+            </w:r>
+            <w:proofErr w:type="spellEnd"/>
+            <w:r>
+              <w:rPr>
+                <w:sz w:val="32"/>
+                <w:szCs w:val="32"/>
+              </w:rPr>
+              <w:t xml:space="preserve"> &lt;container&gt;</w:t>
+            </w:r>
+          </w:p>
+        </w:tc>
+        <w:tc>
+          <w:tcPr>
+            <w:tcW w:w="3865" w:type="dxa"/>
+          </w:tcPr>
+          <w:p>
+            <w:pPr>
+              <w:rPr>
+                <w:sz w:val="32"/>
+                <w:szCs w:val="32"/>
+              </w:rPr>
+            </w:pPr>
+            <w:r>
+              <w:rPr>
+                <w:sz w:val="32"/>
+                <w:szCs w:val="32"/>
+              </w:rPr>
+              <w:t>Delete stopped container</w:t>
+            </w:r>
+          </w:p>
+        </w:tc>
+      </w:tr>
+      <w:tr>
+        <w:tc>
+          <w:tcPr>
+            <w:tcW w:w="5485" w:type="dxa"/>
+          </w:tcPr>
+          <w:p>
+            <w:pPr>
+              <w:rPr>
+                <w:sz w:val="32"/>
+                <w:szCs w:val="32"/>
+              </w:rPr>
+            </w:pPr>
+            <w:proofErr w:type="spellStart"/>
+            <w:r>
+              <w:rPr>
+                <w:sz w:val="32"/>
+                <w:szCs w:val="32"/>
+              </w:rPr>
+              <w:t>docker</w:t>
+            </w:r>
+            <w:proofErr w:type="spellEnd"/>
+            <w:r>
+              <w:rPr>
+                <w:sz w:val="32"/>
+                <w:szCs w:val="32"/>
+              </w:rPr>
+              <w:t xml:space="preserve"> </w:t>
+            </w:r>
+            <w:proofErr w:type="spellStart"/>
+            <w:r>
+              <w:rPr>
+                <w:sz w:val="32"/>
+                <w:szCs w:val="32"/>
+              </w:rPr>
+              <w:t>rm</w:t>
+            </w:r>
+            <w:proofErr w:type="spellEnd"/>
+            <w:r>
+              <w:rPr>
+                <w:sz w:val="32"/>
+                <w:szCs w:val="32"/>
+              </w:rPr>
+              <w:t xml:space="preserve"> &lt;container&gt; -f </w:t>
+            </w:r>
+          </w:p>
+        </w:tc>
+        <w:tc>
+          <w:tcPr>
+            <w:tcW w:w="3865" w:type="dxa"/>
+          </w:tcPr>
+          <w:p>
+            <w:pPr>
+              <w:rPr>
+                <w:sz w:val="32"/>
+                <w:szCs w:val="32"/>
+              </w:rPr>
+            </w:pPr>
+            <w:r>
+              <w:rPr>
+                <w:sz w:val="32"/>
+                <w:szCs w:val="32"/>
+              </w:rPr>
+              <w:t xml:space="preserve">Delete container without having to stop it </w:t>
+            </w:r>
+          </w:p>
+        </w:tc>
+      </w:tr>
+      <w:tr>
+        <w:tc>
+          <w:tcPr>
+            <w:tcW w:w="5485" w:type="dxa"/>
+          </w:tcPr>
+          <w:p>
+            <w:pPr>
+              <w:rPr>
+                <w:sz w:val="32"/>
+                <w:szCs w:val="32"/>
+              </w:rPr>
+            </w:pPr>
+            <w:proofErr w:type="spellStart"/>
+            <w:r>
+              <w:rPr>
+                <w:sz w:val="32"/>
+                <w:szCs w:val="32"/>
+              </w:rPr>
+              <w:t>docker</w:t>
+            </w:r>
+            <w:proofErr w:type="spellEnd"/>
+            <w:r>
+              <w:rPr>
+                <w:sz w:val="32"/>
+                <w:szCs w:val="32"/>
+              </w:rPr>
+              <w:t xml:space="preserve"> inspect &lt;container&gt;</w:t>
+            </w:r>
+            <w:bookmarkStart w:id="0" w:name="_GoBack"/>
+            <w:bookmarkEnd w:id="0"/>
+          </w:p>
+        </w:tc>
+        <w:tc>
+          <w:tcPr>
+            <w:tcW w:w="3865" w:type="dxa"/>
+          </w:tcPr>
+          <w:p>
+            <w:pPr>
+              <w:rPr>
+                <w:sz w:val="32"/>
+                <w:szCs w:val="32"/>
+              </w:rPr>
+            </w:pPr>
+            <w:r>
+              <w:rPr>
+                <w:sz w:val="32"/>
+                <w:szCs w:val="32"/>
+              </w:rPr>
+              <w:t>Show detailed configuration and run-time information about container</w:t>
+            </w:r>
+          </w:p>
+        </w:tc>
+      </w:tr>
+    </w:tbl>
     <w:p>
       <w:pPr>
         <w:rPr>
@@ -10550,54 +11964,264 @@
           <w:sz w:val="32"/>
           <w:szCs w:val="32"/>
         </w:rPr>
+        <w:t>9.6 Deploy apps with Compose</w:t>
+      </w:r>
+    </w:p>
+    <w:p>
+      <w:pPr>
+        <w:rPr>
+          <w:sz w:val="32"/>
+          <w:szCs w:val="32"/>
+        </w:rPr>
+      </w:pPr>
+    </w:p>
+    <w:p>
+      <w:pPr>
+        <w:rPr>
+          <w:sz w:val="32"/>
+          <w:szCs w:val="32"/>
+        </w:rPr>
+      </w:pPr>
+      <w:r>
+        <w:rPr>
+          <w:sz w:val="32"/>
+          <w:szCs w:val="32"/>
+        </w:rPr>
+        <w:t>9.7 Manage apps with Compose</w:t>
+      </w:r>
+    </w:p>
+    <w:p>
+      <w:pPr>
+        <w:rPr>
+          <w:sz w:val="32"/>
+          <w:szCs w:val="32"/>
+        </w:rPr>
+      </w:pPr>
+    </w:p>
+    <w:p>
+      <w:pPr>
+        <w:rPr>
+          <w:sz w:val="32"/>
+          <w:szCs w:val="32"/>
+        </w:rPr>
+      </w:pPr>
+      <w:r>
+        <w:rPr>
+          <w:sz w:val="32"/>
+          <w:szCs w:val="32"/>
+        </w:rPr>
+        <w:t>9.8 Deploy apps with Compose – The commands</w:t>
+      </w:r>
+    </w:p>
+    <w:p>
+      <w:pPr>
+        <w:rPr>
+          <w:sz w:val="32"/>
+          <w:szCs w:val="32"/>
+        </w:rPr>
+      </w:pPr>
+    </w:p>
+    <w:p>
+      <w:pPr>
+        <w:pStyle w:val="Heading1"/>
+        <w:rPr>
+          <w:color w:val="EE0000"/>
+          <w:sz w:val="32"/>
+          <w:szCs w:val="32"/>
+        </w:rPr>
+      </w:pPr>
+      <w:r>
+        <w:rPr>
+          <w:color w:val="EE0000"/>
+          <w:sz w:val="32"/>
+          <w:szCs w:val="32"/>
+        </w:rPr>
         <w:lastRenderedPageBreak/>
-        <w:t>9.6 Deploy apps with Compose</w:t>
-      </w:r>
-    </w:p>
-    <w:p>
-      <w:pPr>
-        <w:rPr>
-          <w:sz w:val="32"/>
-          <w:szCs w:val="32"/>
-        </w:rPr>
-      </w:pPr>
-    </w:p>
-    <w:p>
-      <w:pPr>
-        <w:rPr>
-          <w:sz w:val="32"/>
-          <w:szCs w:val="32"/>
-        </w:rPr>
-      </w:pPr>
-      <w:r>
-        <w:rPr>
-          <w:sz w:val="32"/>
-          <w:szCs w:val="32"/>
-        </w:rPr>
-        <w:t>9.7 Manage apps with Compose</w:t>
-      </w:r>
-    </w:p>
-    <w:p>
-      <w:pPr>
-        <w:rPr>
-          <w:sz w:val="32"/>
-          <w:szCs w:val="32"/>
-        </w:rPr>
-      </w:pPr>
-    </w:p>
-    <w:p>
-      <w:pPr>
-        <w:rPr>
-          <w:sz w:val="32"/>
-          <w:szCs w:val="32"/>
-        </w:rPr>
-      </w:pPr>
-      <w:r>
-        <w:rPr>
-          <w:sz w:val="32"/>
-          <w:szCs w:val="32"/>
-        </w:rPr>
-        <w:t>9.8 Deploy apps with Compose – The commands</w:t>
+        <w:t>10. Docker and AI</w:t>
+      </w:r>
+    </w:p>
+    <w:p>
+      <w:pPr>
+        <w:rPr>
+          <w:sz w:val="32"/>
+          <w:szCs w:val="32"/>
+        </w:rPr>
+      </w:pPr>
+    </w:p>
+    <w:p>
+      <w:pPr>
+        <w:rPr>
+          <w:sz w:val="32"/>
+          <w:szCs w:val="32"/>
+        </w:rPr>
+      </w:pPr>
+      <w:r>
+        <w:rPr>
+          <w:sz w:val="32"/>
+          <w:szCs w:val="32"/>
+        </w:rPr>
+        <w:t>10.1 Docker Model Runner background</w:t>
+      </w:r>
+    </w:p>
+    <w:p>
+      <w:pPr>
+        <w:rPr>
+          <w:sz w:val="32"/>
+          <w:szCs w:val="32"/>
+        </w:rPr>
+      </w:pPr>
+    </w:p>
+    <w:p>
+      <w:pPr>
+        <w:rPr>
+          <w:sz w:val="32"/>
+          <w:szCs w:val="32"/>
+        </w:rPr>
+      </w:pPr>
+      <w:r>
+        <w:rPr>
+          <w:sz w:val="32"/>
+          <w:szCs w:val="32"/>
+        </w:rPr>
+        <w:t>10.2 Docker Model Runner Architecture</w:t>
+      </w:r>
+    </w:p>
+    <w:p>
+      <w:pPr>
+        <w:rPr>
+          <w:sz w:val="32"/>
+          <w:szCs w:val="32"/>
+        </w:rPr>
+      </w:pPr>
+    </w:p>
+    <w:p>
+      <w:pPr>
+        <w:rPr>
+          <w:sz w:val="32"/>
+          <w:szCs w:val="32"/>
+        </w:rPr>
+      </w:pPr>
+      <w:r>
+        <w:rPr>
+          <w:sz w:val="32"/>
+          <w:szCs w:val="32"/>
+        </w:rPr>
+        <w:t>10.3 Install Docker Model Runner</w:t>
+      </w:r>
+    </w:p>
+    <w:p>
+      <w:pPr>
+        <w:rPr>
+          <w:sz w:val="32"/>
+          <w:szCs w:val="32"/>
+        </w:rPr>
+      </w:pPr>
+    </w:p>
+    <w:p>
+      <w:pPr>
+        <w:rPr>
+          <w:sz w:val="32"/>
+          <w:szCs w:val="32"/>
+        </w:rPr>
+      </w:pPr>
+      <w:r>
+        <w:rPr>
+          <w:sz w:val="32"/>
+          <w:szCs w:val="32"/>
+        </w:rPr>
+        <w:t>10.4 Explore Docker Model Runner</w:t>
+      </w:r>
+    </w:p>
+    <w:p>
+      <w:pPr>
+        <w:rPr>
+          <w:sz w:val="32"/>
+          <w:szCs w:val="32"/>
+        </w:rPr>
+      </w:pPr>
+    </w:p>
+    <w:p>
+      <w:pPr>
+        <w:rPr>
+          <w:sz w:val="32"/>
+          <w:szCs w:val="32"/>
+        </w:rPr>
+      </w:pPr>
+      <w:r>
+        <w:rPr>
+          <w:sz w:val="32"/>
+          <w:szCs w:val="32"/>
+        </w:rPr>
+        <w:t>10.5 Use Docker Model Runner with Compose</w:t>
+      </w:r>
+    </w:p>
+    <w:p>
+      <w:pPr>
+        <w:rPr>
+          <w:sz w:val="32"/>
+          <w:szCs w:val="32"/>
+        </w:rPr>
+      </w:pPr>
+    </w:p>
+    <w:p>
+      <w:pPr>
+        <w:rPr>
+          <w:sz w:val="32"/>
+          <w:szCs w:val="32"/>
+        </w:rPr>
+      </w:pPr>
+      <w:r>
+        <w:rPr>
+          <w:sz w:val="32"/>
+          <w:szCs w:val="32"/>
+        </w:rPr>
+        <w:t>10.6 Use Docker Model Runner with Open WebUI</w:t>
+      </w:r>
+    </w:p>
+    <w:p>
+      <w:pPr>
+        <w:rPr>
+          <w:sz w:val="32"/>
+          <w:szCs w:val="32"/>
+        </w:rPr>
+      </w:pPr>
+    </w:p>
+    <w:p>
+      <w:pPr>
+        <w:rPr>
+          <w:sz w:val="32"/>
+          <w:szCs w:val="32"/>
+        </w:rPr>
+      </w:pPr>
+      <w:r>
+        <w:rPr>
+          <w:sz w:val="32"/>
+          <w:szCs w:val="32"/>
+        </w:rPr>
+        <w:t>10.7 Run models in containers</w:t>
+      </w:r>
+    </w:p>
+    <w:p>
+      <w:pPr>
+        <w:rPr>
+          <w:sz w:val="32"/>
+          <w:szCs w:val="32"/>
+        </w:rPr>
+      </w:pPr>
+    </w:p>
+    <w:p>
+      <w:pPr>
+        <w:rPr>
+          <w:sz w:val="32"/>
+          <w:szCs w:val="32"/>
+        </w:rPr>
+      </w:pPr>
+      <w:r>
+        <w:rPr>
+          <w:sz w:val="32"/>
+          <w:szCs w:val="32"/>
+        </w:rPr>
+        <w:t>10.8 Docker Model Runner – The commands</w:t>
       </w:r>
     </w:p>
     <w:p>
@@ -10623,191 +12247,244 @@
           <w:sz w:val="32"/>
           <w:szCs w:val="32"/>
         </w:rPr>
-        <w:t>10. Docker and AI</w:t>
-      </w:r>
-    </w:p>
-    <w:p>
-      <w:pPr>
-        <w:rPr>
-          <w:sz w:val="32"/>
-          <w:szCs w:val="32"/>
-        </w:rPr>
-      </w:pPr>
-    </w:p>
-    <w:p>
-      <w:pPr>
-        <w:rPr>
-          <w:sz w:val="32"/>
-          <w:szCs w:val="32"/>
-        </w:rPr>
-      </w:pPr>
-      <w:r>
-        <w:rPr>
-          <w:sz w:val="32"/>
-          <w:szCs w:val="32"/>
-        </w:rPr>
-        <w:t>10.1 Docker Model Runner background</w:t>
-      </w:r>
-    </w:p>
-    <w:p>
-      <w:pPr>
-        <w:rPr>
-          <w:sz w:val="32"/>
-          <w:szCs w:val="32"/>
-        </w:rPr>
-      </w:pPr>
-    </w:p>
-    <w:p>
-      <w:pPr>
-        <w:rPr>
-          <w:sz w:val="32"/>
-          <w:szCs w:val="32"/>
-        </w:rPr>
-      </w:pPr>
-      <w:r>
-        <w:rPr>
-          <w:sz w:val="32"/>
-          <w:szCs w:val="32"/>
-        </w:rPr>
-        <w:t>10.2 Docker Model Runner Architecture</w:t>
-      </w:r>
-    </w:p>
-    <w:p>
-      <w:pPr>
-        <w:rPr>
-          <w:sz w:val="32"/>
-          <w:szCs w:val="32"/>
-        </w:rPr>
-      </w:pPr>
-    </w:p>
-    <w:p>
-      <w:pPr>
-        <w:rPr>
-          <w:sz w:val="32"/>
-          <w:szCs w:val="32"/>
-        </w:rPr>
-      </w:pPr>
-      <w:r>
-        <w:rPr>
-          <w:sz w:val="32"/>
-          <w:szCs w:val="32"/>
-        </w:rPr>
-        <w:t>10.3 Install Docker Model Runner</w:t>
-      </w:r>
-    </w:p>
-    <w:p>
-      <w:pPr>
-        <w:rPr>
-          <w:sz w:val="32"/>
-          <w:szCs w:val="32"/>
-        </w:rPr>
-      </w:pPr>
-    </w:p>
-    <w:p>
-      <w:pPr>
-        <w:rPr>
-          <w:sz w:val="32"/>
-          <w:szCs w:val="32"/>
-        </w:rPr>
-      </w:pPr>
-      <w:r>
-        <w:rPr>
-          <w:sz w:val="32"/>
-          <w:szCs w:val="32"/>
-        </w:rPr>
-        <w:t>10.4 Explore Docker Model Runner</w:t>
-      </w:r>
-    </w:p>
-    <w:p>
-      <w:pPr>
-        <w:rPr>
-          <w:sz w:val="32"/>
-          <w:szCs w:val="32"/>
-        </w:rPr>
-      </w:pPr>
-    </w:p>
-    <w:p>
-      <w:pPr>
-        <w:rPr>
-          <w:sz w:val="32"/>
-          <w:szCs w:val="32"/>
-        </w:rPr>
-      </w:pPr>
-      <w:r>
-        <w:rPr>
-          <w:sz w:val="32"/>
-          <w:szCs w:val="32"/>
-        </w:rPr>
-        <w:t>10.5 Use Docker Model Runner with Compose</w:t>
-      </w:r>
-    </w:p>
-    <w:p>
-      <w:pPr>
-        <w:rPr>
-          <w:sz w:val="32"/>
-          <w:szCs w:val="32"/>
-        </w:rPr>
-      </w:pPr>
-    </w:p>
-    <w:p>
-      <w:pPr>
-        <w:rPr>
-          <w:sz w:val="32"/>
-          <w:szCs w:val="32"/>
-        </w:rPr>
-      </w:pPr>
-      <w:r>
-        <w:rPr>
-          <w:sz w:val="32"/>
-          <w:szCs w:val="32"/>
-        </w:rPr>
-        <w:t>10.6 Use Docker Model Runner with Open WebUI</w:t>
-      </w:r>
-    </w:p>
-    <w:p>
-      <w:pPr>
-        <w:rPr>
-          <w:sz w:val="32"/>
-          <w:szCs w:val="32"/>
-        </w:rPr>
-      </w:pPr>
-    </w:p>
-    <w:p>
-      <w:pPr>
-        <w:rPr>
-          <w:sz w:val="32"/>
-          <w:szCs w:val="32"/>
-        </w:rPr>
-      </w:pPr>
-      <w:r>
-        <w:rPr>
-          <w:sz w:val="32"/>
-          <w:szCs w:val="32"/>
-        </w:rPr>
-        <w:t>10.7 Run models in containers</w:t>
-      </w:r>
-    </w:p>
-    <w:p>
-      <w:pPr>
-        <w:rPr>
-          <w:sz w:val="32"/>
-          <w:szCs w:val="32"/>
-        </w:rPr>
-      </w:pPr>
-    </w:p>
-    <w:p>
-      <w:pPr>
-        <w:rPr>
-          <w:sz w:val="32"/>
-          <w:szCs w:val="32"/>
-        </w:rPr>
-      </w:pPr>
-      <w:r>
-        <w:rPr>
-          <w:sz w:val="32"/>
-          <w:szCs w:val="32"/>
-        </w:rPr>
-        <w:t>10.8 Docker Model Runner – The commands</w:t>
+        <w:t xml:space="preserve">11. Docker and </w:t>
+      </w:r>
+      <w:proofErr w:type="spellStart"/>
+      <w:r>
+        <w:rPr>
+          <w:color w:val="EE0000"/>
+          <w:sz w:val="32"/>
+          <w:szCs w:val="32"/>
+        </w:rPr>
+        <w:t>Wasm</w:t>
+      </w:r>
+      <w:proofErr w:type="spellEnd"/>
+    </w:p>
+    <w:p>
+      <w:pPr>
+        <w:rPr>
+          <w:sz w:val="32"/>
+          <w:szCs w:val="32"/>
+        </w:rPr>
+      </w:pPr>
+    </w:p>
+    <w:p>
+      <w:pPr>
+        <w:rPr>
+          <w:sz w:val="32"/>
+          <w:szCs w:val="32"/>
+        </w:rPr>
+      </w:pPr>
+      <w:r>
+        <w:rPr>
+          <w:sz w:val="32"/>
+          <w:szCs w:val="32"/>
+        </w:rPr>
+        <w:t>11.1 Pre-</w:t>
+      </w:r>
+      <w:proofErr w:type="spellStart"/>
+      <w:r>
+        <w:rPr>
+          <w:sz w:val="32"/>
+          <w:szCs w:val="32"/>
+        </w:rPr>
+        <w:t>reqs</w:t>
+      </w:r>
+      <w:proofErr w:type="spellEnd"/>
+    </w:p>
+    <w:p>
+      <w:pPr>
+        <w:rPr>
+          <w:sz w:val="32"/>
+          <w:szCs w:val="32"/>
+        </w:rPr>
+      </w:pPr>
+    </w:p>
+    <w:p>
+      <w:pPr>
+        <w:rPr>
+          <w:sz w:val="32"/>
+          <w:szCs w:val="32"/>
+        </w:rPr>
+      </w:pPr>
+      <w:r>
+        <w:rPr>
+          <w:sz w:val="32"/>
+          <w:szCs w:val="32"/>
+        </w:rPr>
+        <w:t xml:space="preserve">11.2 Intro to </w:t>
+      </w:r>
+      <w:proofErr w:type="spellStart"/>
+      <w:r>
+        <w:rPr>
+          <w:sz w:val="32"/>
+          <w:szCs w:val="32"/>
+        </w:rPr>
+        <w:t>Wasm</w:t>
+      </w:r>
+      <w:proofErr w:type="spellEnd"/>
+      <w:r>
+        <w:rPr>
+          <w:sz w:val="32"/>
+          <w:szCs w:val="32"/>
+        </w:rPr>
+        <w:t xml:space="preserve"> and </w:t>
+      </w:r>
+      <w:proofErr w:type="spellStart"/>
+      <w:r>
+        <w:rPr>
+          <w:sz w:val="32"/>
+          <w:szCs w:val="32"/>
+        </w:rPr>
+        <w:t>Wasm</w:t>
+      </w:r>
+      <w:proofErr w:type="spellEnd"/>
+      <w:r>
+        <w:rPr>
+          <w:sz w:val="32"/>
+          <w:szCs w:val="32"/>
+        </w:rPr>
+        <w:t xml:space="preserve"> containers</w:t>
+      </w:r>
+    </w:p>
+    <w:p>
+      <w:pPr>
+        <w:rPr>
+          <w:sz w:val="32"/>
+          <w:szCs w:val="32"/>
+        </w:rPr>
+      </w:pPr>
+    </w:p>
+    <w:p>
+      <w:pPr>
+        <w:rPr>
+          <w:sz w:val="32"/>
+          <w:szCs w:val="32"/>
+        </w:rPr>
+      </w:pPr>
+      <w:r>
+        <w:rPr>
+          <w:sz w:val="32"/>
+          <w:szCs w:val="32"/>
+        </w:rPr>
+        <w:t xml:space="preserve">11.3 Write a </w:t>
+      </w:r>
+      <w:proofErr w:type="spellStart"/>
+      <w:r>
+        <w:rPr>
+          <w:sz w:val="32"/>
+          <w:szCs w:val="32"/>
+        </w:rPr>
+        <w:t>Wasm</w:t>
+      </w:r>
+      <w:proofErr w:type="spellEnd"/>
+      <w:r>
+        <w:rPr>
+          <w:sz w:val="32"/>
+          <w:szCs w:val="32"/>
+        </w:rPr>
+        <w:t xml:space="preserve"> app</w:t>
+      </w:r>
+    </w:p>
+    <w:p>
+      <w:pPr>
+        <w:rPr>
+          <w:sz w:val="32"/>
+          <w:szCs w:val="32"/>
+        </w:rPr>
+      </w:pPr>
+    </w:p>
+    <w:p>
+      <w:pPr>
+        <w:rPr>
+          <w:sz w:val="32"/>
+          <w:szCs w:val="32"/>
+        </w:rPr>
+      </w:pPr>
+      <w:r>
+        <w:rPr>
+          <w:sz w:val="32"/>
+          <w:szCs w:val="32"/>
+        </w:rPr>
+        <w:t xml:space="preserve">11.4 Containerize a </w:t>
+      </w:r>
+      <w:proofErr w:type="spellStart"/>
+      <w:r>
+        <w:rPr>
+          <w:sz w:val="32"/>
+          <w:szCs w:val="32"/>
+        </w:rPr>
+        <w:t>Wasm</w:t>
+      </w:r>
+      <w:proofErr w:type="spellEnd"/>
+      <w:r>
+        <w:rPr>
+          <w:sz w:val="32"/>
+          <w:szCs w:val="32"/>
+        </w:rPr>
+        <w:t xml:space="preserve"> app</w:t>
+      </w:r>
+    </w:p>
+    <w:p>
+      <w:pPr>
+        <w:rPr>
+          <w:sz w:val="32"/>
+          <w:szCs w:val="32"/>
+        </w:rPr>
+      </w:pPr>
+    </w:p>
+    <w:p>
+      <w:pPr>
+        <w:rPr>
+          <w:sz w:val="32"/>
+          <w:szCs w:val="32"/>
+        </w:rPr>
+      </w:pPr>
+      <w:r>
+        <w:rPr>
+          <w:sz w:val="32"/>
+          <w:szCs w:val="32"/>
+        </w:rPr>
+        <w:t xml:space="preserve">11.5 Run a </w:t>
+      </w:r>
+      <w:proofErr w:type="spellStart"/>
+      <w:r>
+        <w:rPr>
+          <w:sz w:val="32"/>
+          <w:szCs w:val="32"/>
+        </w:rPr>
+        <w:t>Wasm</w:t>
+      </w:r>
+      <w:proofErr w:type="spellEnd"/>
+      <w:r>
+        <w:rPr>
+          <w:sz w:val="32"/>
+          <w:szCs w:val="32"/>
+        </w:rPr>
+        <w:t xml:space="preserve"> container</w:t>
+      </w:r>
+    </w:p>
+    <w:p>
+      <w:pPr>
+        <w:rPr>
+          <w:sz w:val="32"/>
+          <w:szCs w:val="32"/>
+        </w:rPr>
+      </w:pPr>
+    </w:p>
+    <w:p>
+      <w:pPr>
+        <w:rPr>
+          <w:sz w:val="32"/>
+          <w:szCs w:val="32"/>
+        </w:rPr>
+      </w:pPr>
+      <w:r>
+        <w:rPr>
+          <w:sz w:val="32"/>
+          <w:szCs w:val="32"/>
+        </w:rPr>
+        <w:t>11.6 Clean up</w:t>
       </w:r>
     </w:p>
     <w:p>
@@ -10833,244 +12510,248 @@
           <w:sz w:val="32"/>
           <w:szCs w:val="32"/>
         </w:rPr>
-        <w:t xml:space="preserve">11. Docker and </w:t>
-      </w:r>
-      <w:proofErr w:type="spellStart"/>
-      <w:r>
+        <w:t>12. Docker Swarm</w:t>
+      </w:r>
+    </w:p>
+    <w:p>
+      <w:pPr>
+        <w:rPr>
+          <w:sz w:val="32"/>
+          <w:szCs w:val="32"/>
+        </w:rPr>
+      </w:pPr>
+    </w:p>
+    <w:p>
+      <w:pPr>
+        <w:rPr>
+          <w:sz w:val="32"/>
+          <w:szCs w:val="32"/>
+        </w:rPr>
+      </w:pPr>
+      <w:r>
+        <w:rPr>
+          <w:sz w:val="32"/>
+          <w:szCs w:val="32"/>
+        </w:rPr>
+        <w:t>12.1 Swarm primer</w:t>
+      </w:r>
+    </w:p>
+    <w:p>
+      <w:pPr>
+        <w:rPr>
+          <w:sz w:val="32"/>
+          <w:szCs w:val="32"/>
+        </w:rPr>
+      </w:pPr>
+    </w:p>
+    <w:p>
+      <w:pPr>
+        <w:rPr>
+          <w:sz w:val="32"/>
+          <w:szCs w:val="32"/>
+        </w:rPr>
+      </w:pPr>
+      <w:r>
+        <w:rPr>
+          <w:sz w:val="32"/>
+          <w:szCs w:val="32"/>
+        </w:rPr>
+        <w:t>12.2 Build a swarm</w:t>
+      </w:r>
+    </w:p>
+    <w:p>
+      <w:pPr>
+        <w:rPr>
+          <w:sz w:val="32"/>
+          <w:szCs w:val="32"/>
+        </w:rPr>
+      </w:pPr>
+    </w:p>
+    <w:p>
+      <w:pPr>
+        <w:rPr>
+          <w:sz w:val="32"/>
+          <w:szCs w:val="32"/>
+        </w:rPr>
+      </w:pPr>
+      <w:r>
+        <w:rPr>
+          <w:sz w:val="32"/>
+          <w:szCs w:val="32"/>
+        </w:rPr>
+        <w:t>12.3 Deploy Swarm app</w:t>
+      </w:r>
+    </w:p>
+    <w:p>
+      <w:pPr>
+        <w:rPr>
+          <w:sz w:val="32"/>
+          <w:szCs w:val="32"/>
+        </w:rPr>
+      </w:pPr>
+    </w:p>
+    <w:p>
+      <w:pPr>
+        <w:rPr>
+          <w:sz w:val="32"/>
+          <w:szCs w:val="32"/>
+        </w:rPr>
+      </w:pPr>
+      <w:r>
+        <w:rPr>
+          <w:sz w:val="32"/>
+          <w:szCs w:val="32"/>
+        </w:rPr>
+        <w:t>12.4 Docker Swarm – The commands</w:t>
+      </w:r>
+    </w:p>
+    <w:p>
+      <w:pPr>
+        <w:rPr>
+          <w:sz w:val="32"/>
+          <w:szCs w:val="32"/>
+        </w:rPr>
+      </w:pPr>
+    </w:p>
+    <w:p>
+      <w:pPr>
+        <w:pStyle w:val="Heading1"/>
         <w:rPr>
           <w:color w:val="EE0000"/>
           <w:sz w:val="32"/>
           <w:szCs w:val="32"/>
         </w:rPr>
-        <w:t>Wasm</w:t>
-      </w:r>
-      <w:proofErr w:type="spellEnd"/>
-    </w:p>
-    <w:p>
-      <w:pPr>
-        <w:rPr>
-          <w:sz w:val="32"/>
-          <w:szCs w:val="32"/>
-        </w:rPr>
-      </w:pPr>
-    </w:p>
-    <w:p>
-      <w:pPr>
-        <w:rPr>
-          <w:sz w:val="32"/>
-          <w:szCs w:val="32"/>
-        </w:rPr>
-      </w:pPr>
-      <w:r>
-        <w:rPr>
-          <w:sz w:val="32"/>
-          <w:szCs w:val="32"/>
-        </w:rPr>
-        <w:t>11.1 Pre-</w:t>
-      </w:r>
-      <w:proofErr w:type="spellStart"/>
-      <w:r>
-        <w:rPr>
-          <w:sz w:val="32"/>
-          <w:szCs w:val="32"/>
-        </w:rPr>
-        <w:t>reqs</w:t>
-      </w:r>
-      <w:proofErr w:type="spellEnd"/>
-    </w:p>
-    <w:p>
-      <w:pPr>
-        <w:rPr>
-          <w:sz w:val="32"/>
-          <w:szCs w:val="32"/>
-        </w:rPr>
-      </w:pPr>
-    </w:p>
-    <w:p>
-      <w:pPr>
-        <w:rPr>
-          <w:sz w:val="32"/>
-          <w:szCs w:val="32"/>
-        </w:rPr>
-      </w:pPr>
-      <w:r>
-        <w:rPr>
-          <w:sz w:val="32"/>
-          <w:szCs w:val="32"/>
-        </w:rPr>
-        <w:t xml:space="preserve">11.2 Intro to </w:t>
-      </w:r>
-      <w:proofErr w:type="spellStart"/>
-      <w:r>
-        <w:rPr>
-          <w:sz w:val="32"/>
-          <w:szCs w:val="32"/>
-        </w:rPr>
-        <w:t>Wasm</w:t>
-      </w:r>
-      <w:proofErr w:type="spellEnd"/>
-      <w:r>
-        <w:rPr>
-          <w:sz w:val="32"/>
-          <w:szCs w:val="32"/>
-        </w:rPr>
-        <w:t xml:space="preserve"> and </w:t>
-      </w:r>
-      <w:proofErr w:type="spellStart"/>
-      <w:r>
-        <w:rPr>
-          <w:sz w:val="32"/>
-          <w:szCs w:val="32"/>
-        </w:rPr>
-        <w:t>Wasm</w:t>
-      </w:r>
-      <w:proofErr w:type="spellEnd"/>
-      <w:r>
-        <w:rPr>
-          <w:sz w:val="32"/>
-          <w:szCs w:val="32"/>
-        </w:rPr>
-        <w:t xml:space="preserve"> containers</w:t>
-      </w:r>
-    </w:p>
-    <w:p>
-      <w:pPr>
-        <w:rPr>
-          <w:sz w:val="32"/>
-          <w:szCs w:val="32"/>
-        </w:rPr>
-      </w:pPr>
-    </w:p>
-    <w:p>
-      <w:pPr>
-        <w:rPr>
-          <w:sz w:val="32"/>
-          <w:szCs w:val="32"/>
-        </w:rPr>
-      </w:pPr>
-      <w:r>
-        <w:rPr>
-          <w:sz w:val="32"/>
-          <w:szCs w:val="32"/>
-        </w:rPr>
-        <w:t xml:space="preserve">11.3 Write a </w:t>
-      </w:r>
-      <w:proofErr w:type="spellStart"/>
-      <w:r>
-        <w:rPr>
-          <w:sz w:val="32"/>
-          <w:szCs w:val="32"/>
-        </w:rPr>
-        <w:t>Wasm</w:t>
-      </w:r>
-      <w:proofErr w:type="spellEnd"/>
-      <w:r>
-        <w:rPr>
-          <w:sz w:val="32"/>
-          <w:szCs w:val="32"/>
-        </w:rPr>
-        <w:t xml:space="preserve"> app</w:t>
-      </w:r>
-    </w:p>
-    <w:p>
-      <w:pPr>
-        <w:rPr>
-          <w:sz w:val="32"/>
-          <w:szCs w:val="32"/>
-        </w:rPr>
-      </w:pPr>
-    </w:p>
-    <w:p>
-      <w:pPr>
-        <w:rPr>
-          <w:sz w:val="32"/>
-          <w:szCs w:val="32"/>
-        </w:rPr>
-      </w:pPr>
-      <w:r>
-        <w:rPr>
-          <w:sz w:val="32"/>
-          <w:szCs w:val="32"/>
-        </w:rPr>
-        <w:t xml:space="preserve">11.4 Containerize a </w:t>
-      </w:r>
-      <w:proofErr w:type="spellStart"/>
-      <w:r>
-        <w:rPr>
-          <w:sz w:val="32"/>
-          <w:szCs w:val="32"/>
-        </w:rPr>
-        <w:t>Wasm</w:t>
-      </w:r>
-      <w:proofErr w:type="spellEnd"/>
-      <w:r>
-        <w:rPr>
-          <w:sz w:val="32"/>
-          <w:szCs w:val="32"/>
-        </w:rPr>
-        <w:t xml:space="preserve"> app</w:t>
-      </w:r>
-    </w:p>
-    <w:p>
-      <w:pPr>
-        <w:rPr>
-          <w:sz w:val="32"/>
-          <w:szCs w:val="32"/>
-        </w:rPr>
-      </w:pPr>
-    </w:p>
-    <w:p>
-      <w:pPr>
-        <w:rPr>
-          <w:sz w:val="32"/>
-          <w:szCs w:val="32"/>
-        </w:rPr>
-      </w:pPr>
-      <w:r>
-        <w:rPr>
-          <w:sz w:val="32"/>
-          <w:szCs w:val="32"/>
-        </w:rPr>
-        <w:t xml:space="preserve">11.5 Run a </w:t>
-      </w:r>
-      <w:proofErr w:type="spellStart"/>
-      <w:r>
-        <w:rPr>
-          <w:sz w:val="32"/>
-          <w:szCs w:val="32"/>
-        </w:rPr>
-        <w:t>Wasm</w:t>
-      </w:r>
-      <w:proofErr w:type="spellEnd"/>
-      <w:r>
-        <w:rPr>
-          <w:sz w:val="32"/>
-          <w:szCs w:val="32"/>
-        </w:rPr>
-        <w:t xml:space="preserve"> container</w:t>
-      </w:r>
-    </w:p>
-    <w:p>
-      <w:pPr>
-        <w:rPr>
-          <w:sz w:val="32"/>
-          <w:szCs w:val="32"/>
-        </w:rPr>
-      </w:pPr>
-    </w:p>
-    <w:p>
-      <w:pPr>
-        <w:rPr>
-          <w:sz w:val="32"/>
-          <w:szCs w:val="32"/>
-        </w:rPr>
-      </w:pPr>
-      <w:r>
-        <w:rPr>
-          <w:sz w:val="32"/>
-          <w:szCs w:val="32"/>
-        </w:rPr>
-        <w:t>11.6 Clean up</w:t>
+      </w:pPr>
+      <w:r>
+        <w:rPr>
+          <w:color w:val="EE0000"/>
+          <w:sz w:val="32"/>
+          <w:szCs w:val="32"/>
+        </w:rPr>
+        <w:lastRenderedPageBreak/>
+        <w:t>13. Docker Networking</w:t>
+      </w:r>
+    </w:p>
+    <w:p>
+      <w:pPr>
+        <w:rPr>
+          <w:sz w:val="32"/>
+          <w:szCs w:val="32"/>
+        </w:rPr>
+      </w:pPr>
+    </w:p>
+    <w:p>
+      <w:pPr>
+        <w:rPr>
+          <w:sz w:val="32"/>
+          <w:szCs w:val="32"/>
+        </w:rPr>
+      </w:pPr>
+      <w:r>
+        <w:rPr>
+          <w:sz w:val="32"/>
+          <w:szCs w:val="32"/>
+        </w:rPr>
+        <w:t>13.1 Docker Networking – The TLDR</w:t>
+      </w:r>
+    </w:p>
+    <w:p>
+      <w:pPr>
+        <w:rPr>
+          <w:sz w:val="32"/>
+          <w:szCs w:val="32"/>
+        </w:rPr>
+      </w:pPr>
+    </w:p>
+    <w:p>
+      <w:pPr>
+        <w:rPr>
+          <w:sz w:val="32"/>
+          <w:szCs w:val="32"/>
+        </w:rPr>
+      </w:pPr>
+      <w:r>
+        <w:rPr>
+          <w:sz w:val="32"/>
+          <w:szCs w:val="32"/>
+        </w:rPr>
+        <w:t>13.2 Docker networking theory</w:t>
+      </w:r>
+    </w:p>
+    <w:p>
+      <w:pPr>
+        <w:rPr>
+          <w:sz w:val="32"/>
+          <w:szCs w:val="32"/>
+        </w:rPr>
+      </w:pPr>
+    </w:p>
+    <w:p>
+      <w:pPr>
+        <w:rPr>
+          <w:sz w:val="32"/>
+          <w:szCs w:val="32"/>
+        </w:rPr>
+      </w:pPr>
+      <w:r>
+        <w:rPr>
+          <w:sz w:val="32"/>
+          <w:szCs w:val="32"/>
+        </w:rPr>
+        <w:t xml:space="preserve">13.3 Single-host bridge networks </w:t>
+      </w:r>
+    </w:p>
+    <w:p>
+      <w:pPr>
+        <w:rPr>
+          <w:sz w:val="32"/>
+          <w:szCs w:val="32"/>
+        </w:rPr>
+      </w:pPr>
+    </w:p>
+    <w:p>
+      <w:pPr>
+        <w:rPr>
+          <w:sz w:val="32"/>
+          <w:szCs w:val="32"/>
+        </w:rPr>
+      </w:pPr>
+      <w:r>
+        <w:rPr>
+          <w:sz w:val="32"/>
+          <w:szCs w:val="32"/>
+        </w:rPr>
+        <w:t xml:space="preserve">13.4 </w:t>
+      </w:r>
+      <w:r>
+        <w:rPr>
+          <w:sz w:val="32"/>
+          <w:szCs w:val="32"/>
+        </w:rPr>
+        <w:t>External access via port mappings</w:t>
+      </w:r>
+    </w:p>
+    <w:p>
+      <w:pPr>
+        <w:rPr>
+          <w:sz w:val="32"/>
+          <w:szCs w:val="32"/>
+        </w:rPr>
+      </w:pPr>
+    </w:p>
+    <w:p>
+      <w:pPr>
+        <w:rPr>
+          <w:sz w:val="32"/>
+          <w:szCs w:val="32"/>
+        </w:rPr>
+      </w:pPr>
+      <w:r>
+        <w:rPr>
+          <w:sz w:val="32"/>
+          <w:szCs w:val="32"/>
+        </w:rPr>
+        <w:t>13.5 Docker Networking – The Commands</w:t>
       </w:r>
     </w:p>
     <w:p>
@@ -11096,30 +12777,335 @@
           <w:sz w:val="32"/>
           <w:szCs w:val="32"/>
         </w:rPr>
-        <w:t>12. Docker Swarm</w:t>
-      </w:r>
-    </w:p>
-    <w:p>
-      <w:pPr>
-        <w:rPr>
-          <w:sz w:val="32"/>
-          <w:szCs w:val="32"/>
-        </w:rPr>
-      </w:pPr>
-    </w:p>
-    <w:p>
-      <w:pPr>
-        <w:rPr>
-          <w:sz w:val="32"/>
-          <w:szCs w:val="32"/>
-        </w:rPr>
-      </w:pPr>
-      <w:r>
-        <w:rPr>
-          <w:sz w:val="32"/>
-          <w:szCs w:val="32"/>
-        </w:rPr>
-        <w:t>12.1 Swarm primer</w:t>
+        <w:t>14. Docker overlay networking</w:t>
+      </w:r>
+    </w:p>
+    <w:p>
+      <w:pPr>
+        <w:rPr>
+          <w:sz w:val="32"/>
+          <w:szCs w:val="32"/>
+        </w:rPr>
+      </w:pPr>
+    </w:p>
+    <w:p>
+      <w:pPr>
+        <w:rPr>
+          <w:sz w:val="32"/>
+          <w:szCs w:val="32"/>
+        </w:rPr>
+      </w:pPr>
+      <w:r>
+        <w:rPr>
+          <w:sz w:val="32"/>
+          <w:szCs w:val="32"/>
+        </w:rPr>
+        <w:t xml:space="preserve">14.1 Docker overlay networking – The TLDR </w:t>
+      </w:r>
+    </w:p>
+    <w:p>
+      <w:pPr>
+        <w:rPr>
+          <w:sz w:val="32"/>
+          <w:szCs w:val="32"/>
+        </w:rPr>
+      </w:pPr>
+    </w:p>
+    <w:p>
+      <w:pPr>
+        <w:rPr>
+          <w:sz w:val="32"/>
+          <w:szCs w:val="32"/>
+        </w:rPr>
+      </w:pPr>
+      <w:r>
+        <w:rPr>
+          <w:sz w:val="32"/>
+          <w:szCs w:val="32"/>
+        </w:rPr>
+        <w:t>14.2 Docker overlay networking history</w:t>
+      </w:r>
+    </w:p>
+    <w:p>
+      <w:pPr>
+        <w:rPr>
+          <w:sz w:val="32"/>
+          <w:szCs w:val="32"/>
+        </w:rPr>
+      </w:pPr>
+    </w:p>
+    <w:p>
+      <w:pPr>
+        <w:rPr>
+          <w:sz w:val="32"/>
+          <w:szCs w:val="32"/>
+        </w:rPr>
+      </w:pPr>
+      <w:r>
+        <w:rPr>
+          <w:sz w:val="32"/>
+          <w:szCs w:val="32"/>
+        </w:rPr>
+        <w:t xml:space="preserve">14.3 Build and test Docker overlay networks </w:t>
+      </w:r>
+    </w:p>
+    <w:p>
+      <w:pPr>
+        <w:rPr>
+          <w:sz w:val="32"/>
+          <w:szCs w:val="32"/>
+        </w:rPr>
+      </w:pPr>
+    </w:p>
+    <w:p>
+      <w:pPr>
+        <w:rPr>
+          <w:sz w:val="32"/>
+          <w:szCs w:val="32"/>
+        </w:rPr>
+      </w:pPr>
+      <w:r>
+        <w:rPr>
+          <w:sz w:val="32"/>
+          <w:szCs w:val="32"/>
+        </w:rPr>
+        <w:t>14.4 Overlay networking explained</w:t>
+      </w:r>
+    </w:p>
+    <w:p>
+      <w:pPr>
+        <w:rPr>
+          <w:sz w:val="32"/>
+          <w:szCs w:val="32"/>
+        </w:rPr>
+      </w:pPr>
+    </w:p>
+    <w:p>
+      <w:pPr>
+        <w:rPr>
+          <w:sz w:val="32"/>
+          <w:szCs w:val="32"/>
+        </w:rPr>
+      </w:pPr>
+      <w:r>
+        <w:rPr>
+          <w:sz w:val="32"/>
+          <w:szCs w:val="32"/>
+        </w:rPr>
+        <w:t>14.5 Docker overlay networking – The commands</w:t>
+      </w:r>
+    </w:p>
+    <w:p>
+      <w:pPr>
+        <w:rPr>
+          <w:sz w:val="32"/>
+          <w:szCs w:val="32"/>
+        </w:rPr>
+      </w:pPr>
+    </w:p>
+    <w:p>
+      <w:pPr>
+        <w:pStyle w:val="Heading1"/>
+        <w:rPr>
+          <w:color w:val="EE0000"/>
+          <w:sz w:val="32"/>
+          <w:szCs w:val="32"/>
+        </w:rPr>
+      </w:pPr>
+      <w:r>
+        <w:rPr>
+          <w:color w:val="EE0000"/>
+          <w:sz w:val="32"/>
+          <w:szCs w:val="32"/>
+        </w:rPr>
+        <w:t>15. Volumes and persistent data</w:t>
+      </w:r>
+    </w:p>
+    <w:p>
+      <w:pPr>
+        <w:rPr>
+          <w:sz w:val="32"/>
+          <w:szCs w:val="32"/>
+        </w:rPr>
+      </w:pPr>
+    </w:p>
+    <w:p>
+      <w:pPr>
+        <w:rPr>
+          <w:sz w:val="32"/>
+          <w:szCs w:val="32"/>
+        </w:rPr>
+      </w:pPr>
+      <w:r>
+        <w:rPr>
+          <w:sz w:val="32"/>
+          <w:szCs w:val="32"/>
+        </w:rPr>
+        <w:t>15.1 Volumes and persistent data – The TLDR</w:t>
+      </w:r>
+    </w:p>
+    <w:p>
+      <w:pPr>
+        <w:rPr>
+          <w:sz w:val="32"/>
+          <w:szCs w:val="32"/>
+        </w:rPr>
+      </w:pPr>
+    </w:p>
+    <w:p>
+      <w:pPr>
+        <w:rPr>
+          <w:sz w:val="32"/>
+          <w:szCs w:val="32"/>
+        </w:rPr>
+      </w:pPr>
+      <w:r>
+        <w:rPr>
+          <w:sz w:val="32"/>
+          <w:szCs w:val="32"/>
+        </w:rPr>
+        <w:t>15.2 Containers without volumes</w:t>
+      </w:r>
+    </w:p>
+    <w:p>
+      <w:pPr>
+        <w:rPr>
+          <w:sz w:val="32"/>
+          <w:szCs w:val="32"/>
+        </w:rPr>
+      </w:pPr>
+    </w:p>
+    <w:p>
+      <w:pPr>
+        <w:rPr>
+          <w:sz w:val="32"/>
+          <w:szCs w:val="32"/>
+        </w:rPr>
+      </w:pPr>
+      <w:r>
+        <w:rPr>
+          <w:sz w:val="32"/>
+          <w:szCs w:val="32"/>
+        </w:rPr>
+        <w:t>15.3 Containers with volumes</w:t>
+      </w:r>
+    </w:p>
+    <w:p>
+      <w:pPr>
+        <w:rPr>
+          <w:sz w:val="32"/>
+          <w:szCs w:val="32"/>
+        </w:rPr>
+      </w:pPr>
+    </w:p>
+    <w:p>
+      <w:pPr>
+        <w:rPr>
+          <w:sz w:val="32"/>
+          <w:szCs w:val="32"/>
+        </w:rPr>
+      </w:pPr>
+      <w:r>
+        <w:rPr>
+          <w:sz w:val="32"/>
+          <w:szCs w:val="32"/>
+        </w:rPr>
+        <w:t>15.4 Volumes and persistent data – The commands</w:t>
+      </w:r>
+    </w:p>
+    <w:p>
+      <w:pPr>
+        <w:rPr>
+          <w:sz w:val="32"/>
+          <w:szCs w:val="32"/>
+        </w:rPr>
+      </w:pPr>
+    </w:p>
+    <w:p>
+      <w:pPr>
+        <w:pStyle w:val="Heading1"/>
+        <w:rPr>
+          <w:color w:val="EE0000"/>
+          <w:sz w:val="32"/>
+          <w:szCs w:val="32"/>
+        </w:rPr>
+      </w:pPr>
+      <w:r>
+        <w:rPr>
+          <w:color w:val="EE0000"/>
+          <w:sz w:val="32"/>
+          <w:szCs w:val="32"/>
+        </w:rPr>
+        <w:t>16. Docker security</w:t>
+      </w:r>
+    </w:p>
+    <w:p>
+      <w:pPr>
+        <w:rPr>
+          <w:sz w:val="32"/>
+          <w:szCs w:val="32"/>
+        </w:rPr>
+      </w:pPr>
+    </w:p>
+    <w:p>
+      <w:pPr>
+        <w:rPr>
+          <w:sz w:val="32"/>
+          <w:szCs w:val="32"/>
+        </w:rPr>
+      </w:pPr>
+      <w:r>
+        <w:rPr>
+          <w:sz w:val="32"/>
+          <w:szCs w:val="32"/>
+        </w:rPr>
+        <w:t>16.1 Docker security – The TLDR</w:t>
+      </w:r>
+    </w:p>
+    <w:p>
+      <w:pPr>
+        <w:rPr>
+          <w:sz w:val="32"/>
+          <w:szCs w:val="32"/>
+        </w:rPr>
+      </w:pPr>
+    </w:p>
+    <w:p>
+      <w:pPr>
+        <w:rPr>
+          <w:sz w:val="32"/>
+          <w:szCs w:val="32"/>
+        </w:rPr>
+      </w:pPr>
+      <w:r>
+        <w:rPr>
+          <w:sz w:val="32"/>
+          <w:szCs w:val="32"/>
+        </w:rPr>
+        <w:t>16.2 Kernel Namespaces</w:t>
+      </w:r>
+    </w:p>
+    <w:p>
+      <w:pPr>
+        <w:rPr>
+          <w:sz w:val="32"/>
+          <w:szCs w:val="32"/>
+        </w:rPr>
+      </w:pPr>
+    </w:p>
+    <w:p>
+      <w:pPr>
+        <w:rPr>
+          <w:sz w:val="32"/>
+          <w:szCs w:val="32"/>
+        </w:rPr>
+      </w:pPr>
+      <w:r>
+        <w:rPr>
+          <w:sz w:val="32"/>
+          <w:szCs w:val="32"/>
+        </w:rPr>
+        <w:t>16.3 Control Groups</w:t>
       </w:r>
     </w:p>
     <w:p>
@@ -11143,578 +13129,6 @@
           <w:szCs w:val="32"/>
         </w:rPr>
         <w:lastRenderedPageBreak/>
-        <w:t>12.2 Build a swarm</w:t>
-      </w:r>
-    </w:p>
-    <w:p>
-      <w:pPr>
-        <w:rPr>
-          <w:sz w:val="32"/>
-          <w:szCs w:val="32"/>
-        </w:rPr>
-      </w:pPr>
-    </w:p>
-    <w:p>
-      <w:pPr>
-        <w:rPr>
-          <w:sz w:val="32"/>
-          <w:szCs w:val="32"/>
-        </w:rPr>
-      </w:pPr>
-      <w:r>
-        <w:rPr>
-          <w:sz w:val="32"/>
-          <w:szCs w:val="32"/>
-        </w:rPr>
-        <w:t>12.3 Deploy Swarm app</w:t>
-      </w:r>
-    </w:p>
-    <w:p>
-      <w:pPr>
-        <w:rPr>
-          <w:sz w:val="32"/>
-          <w:szCs w:val="32"/>
-        </w:rPr>
-      </w:pPr>
-    </w:p>
-    <w:p>
-      <w:pPr>
-        <w:rPr>
-          <w:sz w:val="32"/>
-          <w:szCs w:val="32"/>
-        </w:rPr>
-      </w:pPr>
-      <w:r>
-        <w:rPr>
-          <w:sz w:val="32"/>
-          <w:szCs w:val="32"/>
-        </w:rPr>
-        <w:t>12.4 Docker Swarm – The commands</w:t>
-      </w:r>
-    </w:p>
-    <w:p>
-      <w:pPr>
-        <w:rPr>
-          <w:sz w:val="32"/>
-          <w:szCs w:val="32"/>
-        </w:rPr>
-      </w:pPr>
-    </w:p>
-    <w:p>
-      <w:pPr>
-        <w:pStyle w:val="Heading1"/>
-        <w:rPr>
-          <w:color w:val="EE0000"/>
-          <w:sz w:val="32"/>
-          <w:szCs w:val="32"/>
-        </w:rPr>
-      </w:pPr>
-      <w:r>
-        <w:rPr>
-          <w:color w:val="EE0000"/>
-          <w:sz w:val="32"/>
-          <w:szCs w:val="32"/>
-        </w:rPr>
-        <w:t>13. Docker Networking</w:t>
-      </w:r>
-    </w:p>
-    <w:p>
-      <w:pPr>
-        <w:rPr>
-          <w:sz w:val="32"/>
-          <w:szCs w:val="32"/>
-        </w:rPr>
-      </w:pPr>
-    </w:p>
-    <w:p>
-      <w:pPr>
-        <w:rPr>
-          <w:sz w:val="32"/>
-          <w:szCs w:val="32"/>
-        </w:rPr>
-      </w:pPr>
-      <w:r>
-        <w:rPr>
-          <w:sz w:val="32"/>
-          <w:szCs w:val="32"/>
-        </w:rPr>
-        <w:t>13.1 Docker Networking – The TLDR</w:t>
-      </w:r>
-    </w:p>
-    <w:p>
-      <w:pPr>
-        <w:rPr>
-          <w:sz w:val="32"/>
-          <w:szCs w:val="32"/>
-        </w:rPr>
-      </w:pPr>
-    </w:p>
-    <w:p>
-      <w:pPr>
-        <w:rPr>
-          <w:sz w:val="32"/>
-          <w:szCs w:val="32"/>
-        </w:rPr>
-      </w:pPr>
-      <w:r>
-        <w:rPr>
-          <w:sz w:val="32"/>
-          <w:szCs w:val="32"/>
-        </w:rPr>
-        <w:t>13.2 Docker networking theory</w:t>
-      </w:r>
-    </w:p>
-    <w:p>
-      <w:pPr>
-        <w:rPr>
-          <w:sz w:val="32"/>
-          <w:szCs w:val="32"/>
-        </w:rPr>
-      </w:pPr>
-    </w:p>
-    <w:p>
-      <w:pPr>
-        <w:rPr>
-          <w:sz w:val="32"/>
-          <w:szCs w:val="32"/>
-        </w:rPr>
-      </w:pPr>
-      <w:r>
-        <w:rPr>
-          <w:sz w:val="32"/>
-          <w:szCs w:val="32"/>
-        </w:rPr>
-        <w:t xml:space="preserve">13.3 Single-host bridge networks </w:t>
-      </w:r>
-    </w:p>
-    <w:p>
-      <w:pPr>
-        <w:rPr>
-          <w:sz w:val="32"/>
-          <w:szCs w:val="32"/>
-        </w:rPr>
-      </w:pPr>
-    </w:p>
-    <w:p>
-      <w:pPr>
-        <w:rPr>
-          <w:sz w:val="32"/>
-          <w:szCs w:val="32"/>
-        </w:rPr>
-      </w:pPr>
-      <w:r>
-        <w:rPr>
-          <w:sz w:val="32"/>
-          <w:szCs w:val="32"/>
-        </w:rPr>
-        <w:t xml:space="preserve">13.4 </w:t>
-      </w:r>
-      <w:r>
-        <w:rPr>
-          <w:sz w:val="32"/>
-          <w:szCs w:val="32"/>
-        </w:rPr>
-        <w:t>External access via port mappings</w:t>
-      </w:r>
-    </w:p>
-    <w:p>
-      <w:pPr>
-        <w:rPr>
-          <w:sz w:val="32"/>
-          <w:szCs w:val="32"/>
-        </w:rPr>
-      </w:pPr>
-    </w:p>
-    <w:p>
-      <w:pPr>
-        <w:rPr>
-          <w:sz w:val="32"/>
-          <w:szCs w:val="32"/>
-        </w:rPr>
-      </w:pPr>
-      <w:r>
-        <w:rPr>
-          <w:sz w:val="32"/>
-          <w:szCs w:val="32"/>
-        </w:rPr>
-        <w:t>13.5 Docker Networking – The Commands</w:t>
-      </w:r>
-    </w:p>
-    <w:p>
-      <w:pPr>
-        <w:rPr>
-          <w:sz w:val="32"/>
-          <w:szCs w:val="32"/>
-        </w:rPr>
-      </w:pPr>
-    </w:p>
-    <w:p>
-      <w:pPr>
-        <w:pStyle w:val="Heading1"/>
-        <w:rPr>
-          <w:color w:val="EE0000"/>
-          <w:sz w:val="32"/>
-          <w:szCs w:val="32"/>
-        </w:rPr>
-      </w:pPr>
-      <w:r>
-        <w:rPr>
-          <w:color w:val="EE0000"/>
-          <w:sz w:val="32"/>
-          <w:szCs w:val="32"/>
-        </w:rPr>
-        <w:t>14. Docker overlay networking</w:t>
-      </w:r>
-    </w:p>
-    <w:p>
-      <w:pPr>
-        <w:rPr>
-          <w:sz w:val="32"/>
-          <w:szCs w:val="32"/>
-        </w:rPr>
-      </w:pPr>
-    </w:p>
-    <w:p>
-      <w:pPr>
-        <w:rPr>
-          <w:sz w:val="32"/>
-          <w:szCs w:val="32"/>
-        </w:rPr>
-      </w:pPr>
-      <w:r>
-        <w:rPr>
-          <w:sz w:val="32"/>
-          <w:szCs w:val="32"/>
-        </w:rPr>
-        <w:t xml:space="preserve">14.1 Docker overlay networking – The TLDR </w:t>
-      </w:r>
-    </w:p>
-    <w:p>
-      <w:pPr>
-        <w:rPr>
-          <w:sz w:val="32"/>
-          <w:szCs w:val="32"/>
-        </w:rPr>
-      </w:pPr>
-    </w:p>
-    <w:p>
-      <w:pPr>
-        <w:rPr>
-          <w:sz w:val="32"/>
-          <w:szCs w:val="32"/>
-        </w:rPr>
-      </w:pPr>
-      <w:r>
-        <w:rPr>
-          <w:sz w:val="32"/>
-          <w:szCs w:val="32"/>
-        </w:rPr>
-        <w:t>14.2 Docker overlay networking history</w:t>
-      </w:r>
-    </w:p>
-    <w:p>
-      <w:pPr>
-        <w:rPr>
-          <w:sz w:val="32"/>
-          <w:szCs w:val="32"/>
-        </w:rPr>
-      </w:pPr>
-    </w:p>
-    <w:p>
-      <w:pPr>
-        <w:rPr>
-          <w:sz w:val="32"/>
-          <w:szCs w:val="32"/>
-        </w:rPr>
-      </w:pPr>
-      <w:r>
-        <w:rPr>
-          <w:sz w:val="32"/>
-          <w:szCs w:val="32"/>
-        </w:rPr>
-        <w:t xml:space="preserve">14.3 Build and test Docker overlay networks </w:t>
-      </w:r>
-    </w:p>
-    <w:p>
-      <w:pPr>
-        <w:rPr>
-          <w:sz w:val="32"/>
-          <w:szCs w:val="32"/>
-        </w:rPr>
-      </w:pPr>
-    </w:p>
-    <w:p>
-      <w:pPr>
-        <w:rPr>
-          <w:sz w:val="32"/>
-          <w:szCs w:val="32"/>
-        </w:rPr>
-      </w:pPr>
-      <w:r>
-        <w:rPr>
-          <w:sz w:val="32"/>
-          <w:szCs w:val="32"/>
-        </w:rPr>
-        <w:t>14.4 Overlay networking explained</w:t>
-      </w:r>
-    </w:p>
-    <w:p>
-      <w:pPr>
-        <w:rPr>
-          <w:sz w:val="32"/>
-          <w:szCs w:val="32"/>
-        </w:rPr>
-      </w:pPr>
-    </w:p>
-    <w:p>
-      <w:pPr>
-        <w:rPr>
-          <w:sz w:val="32"/>
-          <w:szCs w:val="32"/>
-        </w:rPr>
-      </w:pPr>
-      <w:r>
-        <w:rPr>
-          <w:sz w:val="32"/>
-          <w:szCs w:val="32"/>
-        </w:rPr>
-        <w:t>14.5 Docker overlay networking – The commands</w:t>
-      </w:r>
-    </w:p>
-    <w:p>
-      <w:pPr>
-        <w:rPr>
-          <w:sz w:val="32"/>
-          <w:szCs w:val="32"/>
-        </w:rPr>
-      </w:pPr>
-    </w:p>
-    <w:p>
-      <w:pPr>
-        <w:pStyle w:val="Heading1"/>
-        <w:rPr>
-          <w:color w:val="EE0000"/>
-          <w:sz w:val="32"/>
-          <w:szCs w:val="32"/>
-        </w:rPr>
-      </w:pPr>
-      <w:r>
-        <w:rPr>
-          <w:color w:val="EE0000"/>
-          <w:sz w:val="32"/>
-          <w:szCs w:val="32"/>
-        </w:rPr>
-        <w:t>15. Volumes and persistent data</w:t>
-      </w:r>
-    </w:p>
-    <w:p>
-      <w:pPr>
-        <w:rPr>
-          <w:sz w:val="32"/>
-          <w:szCs w:val="32"/>
-        </w:rPr>
-      </w:pPr>
-    </w:p>
-    <w:p>
-      <w:pPr>
-        <w:rPr>
-          <w:sz w:val="32"/>
-          <w:szCs w:val="32"/>
-        </w:rPr>
-      </w:pPr>
-      <w:r>
-        <w:rPr>
-          <w:sz w:val="32"/>
-          <w:szCs w:val="32"/>
-        </w:rPr>
-        <w:t>15.1 Volumes and persistent data – The TLDR</w:t>
-      </w:r>
-    </w:p>
-    <w:p>
-      <w:pPr>
-        <w:rPr>
-          <w:sz w:val="32"/>
-          <w:szCs w:val="32"/>
-        </w:rPr>
-      </w:pPr>
-    </w:p>
-    <w:p>
-      <w:pPr>
-        <w:rPr>
-          <w:sz w:val="32"/>
-          <w:szCs w:val="32"/>
-        </w:rPr>
-      </w:pPr>
-      <w:r>
-        <w:rPr>
-          <w:sz w:val="32"/>
-          <w:szCs w:val="32"/>
-        </w:rPr>
-        <w:t>15.2 Containers without volumes</w:t>
-      </w:r>
-    </w:p>
-    <w:p>
-      <w:pPr>
-        <w:rPr>
-          <w:sz w:val="32"/>
-          <w:szCs w:val="32"/>
-        </w:rPr>
-      </w:pPr>
-    </w:p>
-    <w:p>
-      <w:pPr>
-        <w:rPr>
-          <w:sz w:val="32"/>
-          <w:szCs w:val="32"/>
-        </w:rPr>
-      </w:pPr>
-      <w:r>
-        <w:rPr>
-          <w:sz w:val="32"/>
-          <w:szCs w:val="32"/>
-        </w:rPr>
-        <w:t>15.3 Containers with volumes</w:t>
-      </w:r>
-    </w:p>
-    <w:p>
-      <w:pPr>
-        <w:rPr>
-          <w:sz w:val="32"/>
-          <w:szCs w:val="32"/>
-        </w:rPr>
-      </w:pPr>
-    </w:p>
-    <w:p>
-      <w:pPr>
-        <w:rPr>
-          <w:sz w:val="32"/>
-          <w:szCs w:val="32"/>
-        </w:rPr>
-      </w:pPr>
-      <w:r>
-        <w:rPr>
-          <w:sz w:val="32"/>
-          <w:szCs w:val="32"/>
-        </w:rPr>
-        <w:t>15.4 Volumes and persistent data – The commands</w:t>
-      </w:r>
-    </w:p>
-    <w:p>
-      <w:pPr>
-        <w:rPr>
-          <w:sz w:val="32"/>
-          <w:szCs w:val="32"/>
-        </w:rPr>
-      </w:pPr>
-    </w:p>
-    <w:p>
-      <w:pPr>
-        <w:pStyle w:val="Heading1"/>
-        <w:rPr>
-          <w:color w:val="EE0000"/>
-          <w:sz w:val="32"/>
-          <w:szCs w:val="32"/>
-        </w:rPr>
-      </w:pPr>
-      <w:r>
-        <w:rPr>
-          <w:color w:val="EE0000"/>
-          <w:sz w:val="32"/>
-          <w:szCs w:val="32"/>
-        </w:rPr>
-        <w:t>16. Docker security</w:t>
-      </w:r>
-    </w:p>
-    <w:p>
-      <w:pPr>
-        <w:rPr>
-          <w:sz w:val="32"/>
-          <w:szCs w:val="32"/>
-        </w:rPr>
-      </w:pPr>
-    </w:p>
-    <w:p>
-      <w:pPr>
-        <w:rPr>
-          <w:sz w:val="32"/>
-          <w:szCs w:val="32"/>
-        </w:rPr>
-      </w:pPr>
-      <w:r>
-        <w:rPr>
-          <w:sz w:val="32"/>
-          <w:szCs w:val="32"/>
-        </w:rPr>
-        <w:lastRenderedPageBreak/>
-        <w:t>16.1 Docker security – The TLDR</w:t>
-      </w:r>
-    </w:p>
-    <w:p>
-      <w:pPr>
-        <w:rPr>
-          <w:sz w:val="32"/>
-          <w:szCs w:val="32"/>
-        </w:rPr>
-      </w:pPr>
-    </w:p>
-    <w:p>
-      <w:pPr>
-        <w:rPr>
-          <w:sz w:val="32"/>
-          <w:szCs w:val="32"/>
-        </w:rPr>
-      </w:pPr>
-      <w:r>
-        <w:rPr>
-          <w:sz w:val="32"/>
-          <w:szCs w:val="32"/>
-        </w:rPr>
-        <w:t>16.2 Kernel Namespaces</w:t>
-      </w:r>
-    </w:p>
-    <w:p>
-      <w:pPr>
-        <w:rPr>
-          <w:sz w:val="32"/>
-          <w:szCs w:val="32"/>
-        </w:rPr>
-      </w:pPr>
-    </w:p>
-    <w:p>
-      <w:pPr>
-        <w:rPr>
-          <w:sz w:val="32"/>
-          <w:szCs w:val="32"/>
-        </w:rPr>
-      </w:pPr>
-      <w:r>
-        <w:rPr>
-          <w:sz w:val="32"/>
-          <w:szCs w:val="32"/>
-        </w:rPr>
-        <w:t>16.3 Control Groups</w:t>
-      </w:r>
-    </w:p>
-    <w:p>
-      <w:pPr>
-        <w:rPr>
-          <w:sz w:val="32"/>
-          <w:szCs w:val="32"/>
-        </w:rPr>
-      </w:pPr>
-    </w:p>
-    <w:p>
-      <w:pPr>
-        <w:rPr>
-          <w:sz w:val="32"/>
-          <w:szCs w:val="32"/>
-        </w:rPr>
-      </w:pPr>
-      <w:r>
-        <w:rPr>
-          <w:sz w:val="32"/>
-          <w:szCs w:val="32"/>
-        </w:rPr>
         <w:t>16.4 Capabilities</w:t>
       </w:r>
     </w:p>
@@ -12300,6 +13714,7 @@
   <w:style w:type="paragraph" w:default="1" w:styleId="Normal">
     <w:name w:val="Normal"/>
     <w:qFormat/>
+    <w:rsid w:val="00A81000"/>
   </w:style>
   <w:style w:type="paragraph" w:styleId="Heading1">
     <w:name w:val="heading 1"/>

</xml_diff>